<commit_message>
Ch7 docx: 0.5in first-line indent on body paragraphs
Co-Authored-By: Claude Opus 5.5 <noreply@anthropic.com>
Claude-Session: https://claude.ai/code/session_01Vza9ZbwsuDNV7dNpAiGb3h
</commit_message>
<xml_diff>
--- a/drafts/3SL_Chapter_7.docx
+++ b/drafts/3SL_Chapter_7.docx
@@ -21,7 +21,7 @@
     <w:p>
       <w:pPr>
         <w:spacing w:before="0" w:after="0" w:lineRule="auto" w:line="276"/>
-        <w:ind w:left="0" w:right="0" w:firstLine="0"/>
+        <w:ind w:left="0" w:right="0" w:firstLine="720"/>
         <w:jc w:val="left"/>
       </w:pPr>
       <w:r>
@@ -36,7 +36,7 @@
     <w:p>
       <w:pPr>
         <w:spacing w:before="0" w:after="0" w:lineRule="auto" w:line="276"/>
-        <w:ind w:left="0" w:right="0" w:firstLine="0"/>
+        <w:ind w:left="0" w:right="0" w:firstLine="720"/>
         <w:jc w:val="left"/>
       </w:pPr>
       <w:r>
@@ -51,7 +51,7 @@
     <w:p>
       <w:pPr>
         <w:spacing w:before="0" w:after="0" w:lineRule="auto" w:line="276"/>
-        <w:ind w:left="0" w:right="0" w:firstLine="0"/>
+        <w:ind w:left="0" w:right="0" w:firstLine="720"/>
         <w:jc w:val="left"/>
       </w:pPr>
       <w:r>
@@ -66,7 +66,7 @@
     <w:p>
       <w:pPr>
         <w:spacing w:before="0" w:after="0" w:lineRule="auto" w:line="276"/>
-        <w:ind w:left="0" w:right="0" w:firstLine="0"/>
+        <w:ind w:left="0" w:right="0" w:firstLine="720"/>
         <w:jc w:val="left"/>
       </w:pPr>
       <w:r>
@@ -81,7 +81,7 @@
     <w:p>
       <w:pPr>
         <w:spacing w:before="0" w:after="0" w:lineRule="auto" w:line="276"/>
-        <w:ind w:left="0" w:right="0" w:firstLine="0"/>
+        <w:ind w:left="0" w:right="0" w:firstLine="720"/>
         <w:jc w:val="left"/>
       </w:pPr>
       <w:r>
@@ -96,7 +96,7 @@
     <w:p>
       <w:pPr>
         <w:spacing w:before="0" w:after="0" w:lineRule="auto" w:line="276"/>
-        <w:ind w:left="0" w:right="0" w:firstLine="0"/>
+        <w:ind w:left="0" w:right="0" w:firstLine="720"/>
         <w:jc w:val="left"/>
       </w:pPr>
       <w:r>
@@ -111,7 +111,7 @@
     <w:p>
       <w:pPr>
         <w:spacing w:before="0" w:after="0" w:lineRule="auto" w:line="276"/>
-        <w:ind w:left="0" w:right="0" w:firstLine="0"/>
+        <w:ind w:left="0" w:right="0" w:firstLine="720"/>
         <w:jc w:val="left"/>
       </w:pPr>
       <w:r>
@@ -126,7 +126,7 @@
     <w:p>
       <w:pPr>
         <w:spacing w:before="0" w:after="0" w:lineRule="auto" w:line="276"/>
-        <w:ind w:left="0" w:right="0" w:firstLine="0"/>
+        <w:ind w:left="0" w:right="0" w:firstLine="720"/>
         <w:jc w:val="left"/>
       </w:pPr>
       <w:r>
@@ -141,7 +141,7 @@
     <w:p>
       <w:pPr>
         <w:spacing w:before="0" w:after="0" w:lineRule="auto" w:line="276"/>
-        <w:ind w:left="0" w:right="0" w:firstLine="0"/>
+        <w:ind w:left="0" w:right="0" w:firstLine="720"/>
         <w:jc w:val="left"/>
       </w:pPr>
       <w:r>
@@ -156,7 +156,7 @@
     <w:p>
       <w:pPr>
         <w:spacing w:before="0" w:after="0" w:lineRule="auto" w:line="276"/>
-        <w:ind w:left="0" w:right="0" w:firstLine="0"/>
+        <w:ind w:left="0" w:right="0" w:firstLine="720"/>
         <w:jc w:val="left"/>
       </w:pPr>
       <w:r>
@@ -171,7 +171,7 @@
     <w:p>
       <w:pPr>
         <w:spacing w:before="0" w:after="0" w:lineRule="auto" w:line="276"/>
-        <w:ind w:left="0" w:right="0" w:firstLine="0"/>
+        <w:ind w:left="0" w:right="0" w:firstLine="720"/>
         <w:jc w:val="left"/>
       </w:pPr>
       <w:r>
@@ -186,7 +186,7 @@
     <w:p>
       <w:pPr>
         <w:spacing w:before="0" w:after="0" w:lineRule="auto" w:line="276"/>
-        <w:ind w:left="0" w:right="0" w:firstLine="0"/>
+        <w:ind w:left="0" w:right="0" w:firstLine="720"/>
         <w:jc w:val="left"/>
       </w:pPr>
       <w:r>
@@ -201,7 +201,7 @@
     <w:p>
       <w:pPr>
         <w:spacing w:before="0" w:after="0" w:lineRule="auto" w:line="276"/>
-        <w:ind w:left="0" w:right="0" w:firstLine="0"/>
+        <w:ind w:left="0" w:right="0" w:firstLine="720"/>
         <w:jc w:val="left"/>
       </w:pPr>
       <w:r>
@@ -216,7 +216,7 @@
     <w:p>
       <w:pPr>
         <w:spacing w:before="0" w:after="0" w:lineRule="auto" w:line="276"/>
-        <w:ind w:left="0" w:right="0" w:firstLine="0"/>
+        <w:ind w:left="0" w:right="0" w:firstLine="720"/>
         <w:jc w:val="left"/>
       </w:pPr>
       <w:r>
@@ -231,7 +231,7 @@
     <w:p>
       <w:pPr>
         <w:spacing w:before="0" w:after="0" w:lineRule="auto" w:line="276"/>
-        <w:ind w:left="0" w:right="0" w:firstLine="0"/>
+        <w:ind w:left="0" w:right="0" w:firstLine="720"/>
         <w:jc w:val="left"/>
       </w:pPr>
       <w:r>
@@ -246,7 +246,7 @@
     <w:p>
       <w:pPr>
         <w:spacing w:before="0" w:after="0" w:lineRule="auto" w:line="276"/>
-        <w:ind w:left="0" w:right="0" w:firstLine="0"/>
+        <w:ind w:left="0" w:right="0" w:firstLine="720"/>
         <w:jc w:val="left"/>
       </w:pPr>
       <w:r>
@@ -261,7 +261,7 @@
     <w:p>
       <w:pPr>
         <w:spacing w:before="0" w:after="0" w:lineRule="auto" w:line="276"/>
-        <w:ind w:left="0" w:right="0" w:firstLine="0"/>
+        <w:ind w:left="0" w:right="0" w:firstLine="720"/>
         <w:jc w:val="left"/>
       </w:pPr>
       <w:r>
@@ -276,7 +276,7 @@
     <w:p>
       <w:pPr>
         <w:spacing w:before="0" w:after="0" w:lineRule="auto" w:line="276"/>
-        <w:ind w:left="0" w:right="0" w:firstLine="0"/>
+        <w:ind w:left="0" w:right="0" w:firstLine="720"/>
         <w:jc w:val="left"/>
       </w:pPr>
       <w:r>
@@ -291,7 +291,7 @@
     <w:p>
       <w:pPr>
         <w:spacing w:before="0" w:after="0" w:lineRule="auto" w:line="276"/>
-        <w:ind w:left="0" w:right="0" w:firstLine="0"/>
+        <w:ind w:left="0" w:right="0" w:firstLine="720"/>
         <w:jc w:val="left"/>
       </w:pPr>
       <w:r>
@@ -306,7 +306,7 @@
     <w:p>
       <w:pPr>
         <w:spacing w:before="0" w:after="0" w:lineRule="auto" w:line="276"/>
-        <w:ind w:left="0" w:right="0" w:firstLine="0"/>
+        <w:ind w:left="0" w:right="0" w:firstLine="720"/>
         <w:jc w:val="left"/>
       </w:pPr>
       <w:r>
@@ -321,7 +321,7 @@
     <w:p>
       <w:pPr>
         <w:spacing w:before="0" w:after="0" w:lineRule="auto" w:line="276"/>
-        <w:ind w:left="0" w:right="0" w:firstLine="0"/>
+        <w:ind w:left="0" w:right="0" w:firstLine="720"/>
         <w:jc w:val="left"/>
       </w:pPr>
       <w:r>
@@ -336,7 +336,7 @@
     <w:p>
       <w:pPr>
         <w:spacing w:before="0" w:after="0" w:lineRule="auto" w:line="276"/>
-        <w:ind w:left="0" w:right="0" w:firstLine="0"/>
+        <w:ind w:left="0" w:right="0" w:firstLine="720"/>
         <w:jc w:val="left"/>
       </w:pPr>
       <w:r>
@@ -351,7 +351,7 @@
     <w:p>
       <w:pPr>
         <w:spacing w:before="0" w:after="0" w:lineRule="auto" w:line="276"/>
-        <w:ind w:left="0" w:right="0" w:firstLine="0"/>
+        <w:ind w:left="0" w:right="0" w:firstLine="720"/>
         <w:jc w:val="left"/>
       </w:pPr>
       <w:r>
@@ -383,7 +383,7 @@
     <w:p>
       <w:pPr>
         <w:spacing w:before="0" w:after="0" w:lineRule="auto" w:line="276"/>
-        <w:ind w:left="0" w:right="0" w:firstLine="0"/>
+        <w:ind w:left="0" w:right="0" w:firstLine="720"/>
         <w:jc w:val="left"/>
       </w:pPr>
       <w:r>
@@ -398,7 +398,7 @@
     <w:p>
       <w:pPr>
         <w:spacing w:before="0" w:after="0" w:lineRule="auto" w:line="276"/>
-        <w:ind w:left="0" w:right="0" w:firstLine="0"/>
+        <w:ind w:left="0" w:right="0" w:firstLine="720"/>
         <w:jc w:val="left"/>
       </w:pPr>
       <w:r>
@@ -413,7 +413,7 @@
     <w:p>
       <w:pPr>
         <w:spacing w:before="0" w:after="0" w:lineRule="auto" w:line="276"/>
-        <w:ind w:left="0" w:right="0" w:firstLine="0"/>
+        <w:ind w:left="0" w:right="0" w:firstLine="720"/>
         <w:jc w:val="left"/>
       </w:pPr>
       <w:r>
@@ -428,7 +428,7 @@
     <w:p>
       <w:pPr>
         <w:spacing w:before="0" w:after="0" w:lineRule="auto" w:line="276"/>
-        <w:ind w:left="0" w:right="0" w:firstLine="0"/>
+        <w:ind w:left="0" w:right="0" w:firstLine="720"/>
         <w:jc w:val="left"/>
       </w:pPr>
       <w:r>
@@ -443,7 +443,7 @@
     <w:p>
       <w:pPr>
         <w:spacing w:before="0" w:after="0" w:lineRule="auto" w:line="276"/>
-        <w:ind w:left="0" w:right="0" w:firstLine="0"/>
+        <w:ind w:left="0" w:right="0" w:firstLine="720"/>
         <w:jc w:val="left"/>
       </w:pPr>
       <w:r>
@@ -458,7 +458,7 @@
     <w:p>
       <w:pPr>
         <w:spacing w:before="0" w:after="0" w:lineRule="auto" w:line="276"/>
-        <w:ind w:left="0" w:right="0" w:firstLine="0"/>
+        <w:ind w:left="0" w:right="0" w:firstLine="720"/>
         <w:jc w:val="left"/>
       </w:pPr>
       <w:r>
@@ -473,7 +473,7 @@
     <w:p>
       <w:pPr>
         <w:spacing w:before="0" w:after="0" w:lineRule="auto" w:line="276"/>
-        <w:ind w:left="0" w:right="0" w:firstLine="0"/>
+        <w:ind w:left="0" w:right="0" w:firstLine="720"/>
         <w:jc w:val="left"/>
       </w:pPr>
       <w:r>
@@ -488,7 +488,7 @@
     <w:p>
       <w:pPr>
         <w:spacing w:before="0" w:after="0" w:lineRule="auto" w:line="276"/>
-        <w:ind w:left="0" w:right="0" w:firstLine="0"/>
+        <w:ind w:left="0" w:right="0" w:firstLine="720"/>
         <w:jc w:val="left"/>
       </w:pPr>
       <w:r>
@@ -503,7 +503,7 @@
     <w:p>
       <w:pPr>
         <w:spacing w:before="0" w:after="0" w:lineRule="auto" w:line="276"/>
-        <w:ind w:left="0" w:right="0" w:firstLine="0"/>
+        <w:ind w:left="0" w:right="0" w:firstLine="720"/>
         <w:jc w:val="left"/>
       </w:pPr>
       <w:r>
@@ -518,7 +518,7 @@
     <w:p>
       <w:pPr>
         <w:spacing w:before="0" w:after="0" w:lineRule="auto" w:line="276"/>
-        <w:ind w:left="0" w:right="0" w:firstLine="0"/>
+        <w:ind w:left="0" w:right="0" w:firstLine="720"/>
         <w:jc w:val="left"/>
       </w:pPr>
       <w:r>
@@ -533,7 +533,7 @@
     <w:p>
       <w:pPr>
         <w:spacing w:before="0" w:after="0" w:lineRule="auto" w:line="276"/>
-        <w:ind w:left="0" w:right="0" w:firstLine="0"/>
+        <w:ind w:left="0" w:right="0" w:firstLine="720"/>
         <w:jc w:val="left"/>
       </w:pPr>
       <w:r>
@@ -548,7 +548,7 @@
     <w:p>
       <w:pPr>
         <w:spacing w:before="0" w:after="0" w:lineRule="auto" w:line="276"/>
-        <w:ind w:left="0" w:right="0" w:firstLine="0"/>
+        <w:ind w:left="0" w:right="0" w:firstLine="720"/>
         <w:jc w:val="left"/>
       </w:pPr>
       <w:r>
@@ -563,7 +563,7 @@
     <w:p>
       <w:pPr>
         <w:spacing w:before="0" w:after="0" w:lineRule="auto" w:line="276"/>
-        <w:ind w:left="0" w:right="0" w:firstLine="0"/>
+        <w:ind w:left="0" w:right="0" w:firstLine="720"/>
         <w:jc w:val="left"/>
       </w:pPr>
       <w:r>
@@ -578,7 +578,7 @@
     <w:p>
       <w:pPr>
         <w:spacing w:before="0" w:after="0" w:lineRule="auto" w:line="276"/>
-        <w:ind w:left="0" w:right="0" w:firstLine="0"/>
+        <w:ind w:left="0" w:right="0" w:firstLine="720"/>
         <w:jc w:val="left"/>
       </w:pPr>
       <w:r>
@@ -610,7 +610,7 @@
     <w:p>
       <w:pPr>
         <w:spacing w:before="0" w:after="0" w:lineRule="auto" w:line="276"/>
-        <w:ind w:left="0" w:right="0" w:firstLine="0"/>
+        <w:ind w:left="0" w:right="0" w:firstLine="720"/>
         <w:jc w:val="left"/>
       </w:pPr>
       <w:r>
@@ -625,7 +625,7 @@
     <w:p>
       <w:pPr>
         <w:spacing w:before="0" w:after="0" w:lineRule="auto" w:line="276"/>
-        <w:ind w:left="0" w:right="0" w:firstLine="0"/>
+        <w:ind w:left="0" w:right="0" w:firstLine="720"/>
         <w:jc w:val="left"/>
       </w:pPr>
       <w:r>
@@ -640,7 +640,7 @@
     <w:p>
       <w:pPr>
         <w:spacing w:before="0" w:after="0" w:lineRule="auto" w:line="276"/>
-        <w:ind w:left="0" w:right="0" w:firstLine="0"/>
+        <w:ind w:left="0" w:right="0" w:firstLine="720"/>
         <w:jc w:val="left"/>
       </w:pPr>
       <w:r>
@@ -655,7 +655,7 @@
     <w:p>
       <w:pPr>
         <w:spacing w:before="0" w:after="0" w:lineRule="auto" w:line="276"/>
-        <w:ind w:left="0" w:right="0" w:firstLine="0"/>
+        <w:ind w:left="0" w:right="0" w:firstLine="720"/>
         <w:jc w:val="left"/>
       </w:pPr>
       <w:r>
@@ -670,7 +670,7 @@
     <w:p>
       <w:pPr>
         <w:spacing w:before="0" w:after="0" w:lineRule="auto" w:line="276"/>
-        <w:ind w:left="0" w:right="0" w:firstLine="0"/>
+        <w:ind w:left="0" w:right="0" w:firstLine="720"/>
         <w:jc w:val="left"/>
       </w:pPr>
       <w:r>
@@ -685,7 +685,7 @@
     <w:p>
       <w:pPr>
         <w:spacing w:before="0" w:after="0" w:lineRule="auto" w:line="276"/>
-        <w:ind w:left="0" w:right="0" w:firstLine="0"/>
+        <w:ind w:left="0" w:right="0" w:firstLine="720"/>
         <w:jc w:val="left"/>
       </w:pPr>
       <w:r>
@@ -700,7 +700,7 @@
     <w:p>
       <w:pPr>
         <w:spacing w:before="0" w:after="0" w:lineRule="auto" w:line="276"/>
-        <w:ind w:left="0" w:right="0" w:firstLine="0"/>
+        <w:ind w:left="0" w:right="0" w:firstLine="720"/>
         <w:jc w:val="left"/>
       </w:pPr>
       <w:r>
@@ -715,7 +715,7 @@
     <w:p>
       <w:pPr>
         <w:spacing w:before="0" w:after="0" w:lineRule="auto" w:line="276"/>
-        <w:ind w:left="0" w:right="0" w:firstLine="0"/>
+        <w:ind w:left="0" w:right="0" w:firstLine="720"/>
         <w:jc w:val="left"/>
       </w:pPr>
       <w:r>
@@ -730,7 +730,7 @@
     <w:p>
       <w:pPr>
         <w:spacing w:before="0" w:after="0" w:lineRule="auto" w:line="276"/>
-        <w:ind w:left="0" w:right="0" w:firstLine="0"/>
+        <w:ind w:left="0" w:right="0" w:firstLine="720"/>
         <w:jc w:val="left"/>
       </w:pPr>
       <w:r>
@@ -745,7 +745,7 @@
     <w:p>
       <w:pPr>
         <w:spacing w:before="0" w:after="0" w:lineRule="auto" w:line="276"/>
-        <w:ind w:left="0" w:right="0" w:firstLine="0"/>
+        <w:ind w:left="0" w:right="0" w:firstLine="720"/>
         <w:jc w:val="left"/>
       </w:pPr>
       <w:r>
@@ -760,7 +760,7 @@
     <w:p>
       <w:pPr>
         <w:spacing w:before="0" w:after="0" w:lineRule="auto" w:line="276"/>
-        <w:ind w:left="0" w:right="0" w:firstLine="0"/>
+        <w:ind w:left="0" w:right="0" w:firstLine="720"/>
         <w:jc w:val="left"/>
       </w:pPr>
       <w:r>
@@ -775,7 +775,7 @@
     <w:p>
       <w:pPr>
         <w:spacing w:before="0" w:after="0" w:lineRule="auto" w:line="276"/>
-        <w:ind w:left="0" w:right="0" w:firstLine="0"/>
+        <w:ind w:left="0" w:right="0" w:firstLine="720"/>
         <w:jc w:val="left"/>
       </w:pPr>
       <w:r>
@@ -790,7 +790,7 @@
     <w:p>
       <w:pPr>
         <w:spacing w:before="0" w:after="0" w:lineRule="auto" w:line="276"/>
-        <w:ind w:left="0" w:right="0" w:firstLine="0"/>
+        <w:ind w:left="0" w:right="0" w:firstLine="720"/>
         <w:jc w:val="left"/>
       </w:pPr>
       <w:r>
@@ -805,7 +805,7 @@
     <w:p>
       <w:pPr>
         <w:spacing w:before="0" w:after="0" w:lineRule="auto" w:line="276"/>
-        <w:ind w:left="0" w:right="0" w:firstLine="0"/>
+        <w:ind w:left="0" w:right="0" w:firstLine="720"/>
         <w:jc w:val="left"/>
       </w:pPr>
       <w:r>
@@ -820,7 +820,7 @@
     <w:p>
       <w:pPr>
         <w:spacing w:before="0" w:after="0" w:lineRule="auto" w:line="276"/>
-        <w:ind w:left="0" w:right="0" w:firstLine="0"/>
+        <w:ind w:left="0" w:right="0" w:firstLine="720"/>
         <w:jc w:val="left"/>
       </w:pPr>
       <w:r>
@@ -835,7 +835,7 @@
     <w:p>
       <w:pPr>
         <w:spacing w:before="0" w:after="0" w:lineRule="auto" w:line="276"/>
-        <w:ind w:left="0" w:right="0" w:firstLine="0"/>
+        <w:ind w:left="0" w:right="0" w:firstLine="720"/>
         <w:jc w:val="left"/>
       </w:pPr>
       <w:r>
@@ -850,7 +850,7 @@
     <w:p>
       <w:pPr>
         <w:spacing w:before="0" w:after="0" w:lineRule="auto" w:line="276"/>
-        <w:ind w:left="0" w:right="0" w:firstLine="0"/>
+        <w:ind w:left="0" w:right="0" w:firstLine="720"/>
         <w:jc w:val="left"/>
       </w:pPr>
       <w:r>
@@ -865,7 +865,7 @@
     <w:p>
       <w:pPr>
         <w:spacing w:before="0" w:after="0" w:lineRule="auto" w:line="276"/>
-        <w:ind w:left="0" w:right="0" w:firstLine="0"/>
+        <w:ind w:left="0" w:right="0" w:firstLine="720"/>
         <w:jc w:val="left"/>
       </w:pPr>
       <w:r>
@@ -897,7 +897,7 @@
     <w:p>
       <w:pPr>
         <w:spacing w:before="0" w:after="0" w:lineRule="auto" w:line="276"/>
-        <w:ind w:left="0" w:right="0" w:firstLine="0"/>
+        <w:ind w:left="0" w:right="0" w:firstLine="720"/>
         <w:jc w:val="left"/>
       </w:pPr>
       <w:r>
@@ -912,7 +912,7 @@
     <w:p>
       <w:pPr>
         <w:spacing w:before="0" w:after="0" w:lineRule="auto" w:line="276"/>
-        <w:ind w:left="0" w:right="0" w:firstLine="0"/>
+        <w:ind w:left="0" w:right="0" w:firstLine="720"/>
         <w:jc w:val="left"/>
       </w:pPr>
       <w:r>
@@ -927,7 +927,7 @@
     <w:p>
       <w:pPr>
         <w:spacing w:before="0" w:after="0" w:lineRule="auto" w:line="276"/>
-        <w:ind w:left="0" w:right="0" w:firstLine="0"/>
+        <w:ind w:left="0" w:right="0" w:firstLine="720"/>
         <w:jc w:val="left"/>
       </w:pPr>
       <w:r>
@@ -942,7 +942,7 @@
     <w:p>
       <w:pPr>
         <w:spacing w:before="0" w:after="0" w:lineRule="auto" w:line="276"/>
-        <w:ind w:left="0" w:right="0" w:firstLine="0"/>
+        <w:ind w:left="0" w:right="0" w:firstLine="720"/>
         <w:jc w:val="left"/>
       </w:pPr>
       <w:r>
@@ -957,7 +957,7 @@
     <w:p>
       <w:pPr>
         <w:spacing w:before="0" w:after="0" w:lineRule="auto" w:line="276"/>
-        <w:ind w:left="0" w:right="0" w:firstLine="0"/>
+        <w:ind w:left="0" w:right="0" w:firstLine="720"/>
         <w:jc w:val="left"/>
       </w:pPr>
       <w:r>
@@ -972,7 +972,7 @@
     <w:p>
       <w:pPr>
         <w:spacing w:before="0" w:after="0" w:lineRule="auto" w:line="276"/>
-        <w:ind w:left="0" w:right="0" w:firstLine="0"/>
+        <w:ind w:left="0" w:right="0" w:firstLine="720"/>
         <w:jc w:val="left"/>
       </w:pPr>
       <w:r>
@@ -987,7 +987,7 @@
     <w:p>
       <w:pPr>
         <w:spacing w:before="0" w:after="0" w:lineRule="auto" w:line="276"/>
-        <w:ind w:left="0" w:right="0" w:firstLine="0"/>
+        <w:ind w:left="0" w:right="0" w:firstLine="720"/>
         <w:jc w:val="left"/>
       </w:pPr>
       <w:r>
@@ -1002,7 +1002,7 @@
     <w:p>
       <w:pPr>
         <w:spacing w:before="0" w:after="0" w:lineRule="auto" w:line="276"/>
-        <w:ind w:left="0" w:right="0" w:firstLine="0"/>
+        <w:ind w:left="0" w:right="0" w:firstLine="720"/>
         <w:jc w:val="left"/>
       </w:pPr>
       <w:r>
@@ -1017,7 +1017,7 @@
     <w:p>
       <w:pPr>
         <w:spacing w:before="0" w:after="0" w:lineRule="auto" w:line="276"/>
-        <w:ind w:left="0" w:right="0" w:firstLine="0"/>
+        <w:ind w:left="0" w:right="0" w:firstLine="720"/>
         <w:jc w:val="left"/>
       </w:pPr>
       <w:r>
@@ -1032,7 +1032,7 @@
     <w:p>
       <w:pPr>
         <w:spacing w:before="0" w:after="0" w:lineRule="auto" w:line="276"/>
-        <w:ind w:left="0" w:right="0" w:firstLine="0"/>
+        <w:ind w:left="0" w:right="0" w:firstLine="720"/>
         <w:jc w:val="left"/>
       </w:pPr>
       <w:r>
@@ -1047,7 +1047,7 @@
     <w:p>
       <w:pPr>
         <w:spacing w:before="0" w:after="0" w:lineRule="auto" w:line="276"/>
-        <w:ind w:left="0" w:right="0" w:firstLine="0"/>
+        <w:ind w:left="0" w:right="0" w:firstLine="720"/>
         <w:jc w:val="left"/>
       </w:pPr>
       <w:r>
@@ -1062,7 +1062,7 @@
     <w:p>
       <w:pPr>
         <w:spacing w:before="0" w:after="0" w:lineRule="auto" w:line="276"/>
-        <w:ind w:left="0" w:right="0" w:firstLine="0"/>
+        <w:ind w:left="0" w:right="0" w:firstLine="720"/>
         <w:jc w:val="left"/>
       </w:pPr>
       <w:r>
@@ -1077,7 +1077,7 @@
     <w:p>
       <w:pPr>
         <w:spacing w:before="0" w:after="0" w:lineRule="auto" w:line="276"/>
-        <w:ind w:left="0" w:right="0" w:firstLine="0"/>
+        <w:ind w:left="0" w:right="0" w:firstLine="720"/>
         <w:jc w:val="left"/>
       </w:pPr>
       <w:r>
@@ -1092,7 +1092,7 @@
     <w:p>
       <w:pPr>
         <w:spacing w:before="0" w:after="0" w:lineRule="auto" w:line="276"/>
-        <w:ind w:left="0" w:right="0" w:firstLine="0"/>
+        <w:ind w:left="0" w:right="0" w:firstLine="720"/>
         <w:jc w:val="left"/>
       </w:pPr>
       <w:r>
@@ -1107,7 +1107,7 @@
     <w:p>
       <w:pPr>
         <w:spacing w:before="0" w:after="0" w:lineRule="auto" w:line="276"/>
-        <w:ind w:left="0" w:right="0" w:firstLine="0"/>
+        <w:ind w:left="0" w:right="0" w:firstLine="720"/>
         <w:jc w:val="left"/>
       </w:pPr>
       <w:r>
@@ -1139,7 +1139,7 @@
     <w:p>
       <w:pPr>
         <w:spacing w:before="0" w:after="0" w:lineRule="auto" w:line="276"/>
-        <w:ind w:left="0" w:right="0" w:firstLine="0"/>
+        <w:ind w:left="0" w:right="0" w:firstLine="720"/>
         <w:jc w:val="left"/>
       </w:pPr>
       <w:r>
@@ -1154,7 +1154,7 @@
     <w:p>
       <w:pPr>
         <w:spacing w:before="0" w:after="0" w:lineRule="auto" w:line="276"/>
-        <w:ind w:left="0" w:right="0" w:firstLine="0"/>
+        <w:ind w:left="0" w:right="0" w:firstLine="720"/>
         <w:jc w:val="left"/>
       </w:pPr>
       <w:r>
@@ -1169,7 +1169,7 @@
     <w:p>
       <w:pPr>
         <w:spacing w:before="0" w:after="0" w:lineRule="auto" w:line="276"/>
-        <w:ind w:left="0" w:right="0" w:firstLine="0"/>
+        <w:ind w:left="0" w:right="0" w:firstLine="720"/>
         <w:jc w:val="left"/>
       </w:pPr>
       <w:r>
@@ -1184,7 +1184,7 @@
     <w:p>
       <w:pPr>
         <w:spacing w:before="0" w:after="0" w:lineRule="auto" w:line="276"/>
-        <w:ind w:left="0" w:right="0" w:firstLine="0"/>
+        <w:ind w:left="0" w:right="0" w:firstLine="720"/>
         <w:jc w:val="left"/>
       </w:pPr>
       <w:r>
@@ -1199,7 +1199,7 @@
     <w:p>
       <w:pPr>
         <w:spacing w:before="0" w:after="0" w:lineRule="auto" w:line="276"/>
-        <w:ind w:left="0" w:right="0" w:firstLine="0"/>
+        <w:ind w:left="0" w:right="0" w:firstLine="720"/>
         <w:jc w:val="left"/>
       </w:pPr>
       <w:r>
@@ -1214,7 +1214,7 @@
     <w:p>
       <w:pPr>
         <w:spacing w:before="0" w:after="0" w:lineRule="auto" w:line="276"/>
-        <w:ind w:left="0" w:right="0" w:firstLine="0"/>
+        <w:ind w:left="0" w:right="0" w:firstLine="720"/>
         <w:jc w:val="left"/>
       </w:pPr>
       <w:r>
@@ -1229,7 +1229,7 @@
     <w:p>
       <w:pPr>
         <w:spacing w:before="0" w:after="0" w:lineRule="auto" w:line="276"/>
-        <w:ind w:left="0" w:right="0" w:firstLine="0"/>
+        <w:ind w:left="0" w:right="0" w:firstLine="720"/>
         <w:jc w:val="left"/>
       </w:pPr>
       <w:r>
@@ -1244,7 +1244,7 @@
     <w:p>
       <w:pPr>
         <w:spacing w:before="0" w:after="0" w:lineRule="auto" w:line="276"/>
-        <w:ind w:left="0" w:right="0" w:firstLine="0"/>
+        <w:ind w:left="0" w:right="0" w:firstLine="720"/>
         <w:jc w:val="left"/>
       </w:pPr>
       <w:r>
@@ -1259,7 +1259,7 @@
     <w:p>
       <w:pPr>
         <w:spacing w:before="0" w:after="0" w:lineRule="auto" w:line="276"/>
-        <w:ind w:left="0" w:right="0" w:firstLine="0"/>
+        <w:ind w:left="0" w:right="0" w:firstLine="720"/>
         <w:jc w:val="left"/>
       </w:pPr>
       <w:r>
@@ -1274,7 +1274,7 @@
     <w:p>
       <w:pPr>
         <w:spacing w:before="0" w:after="0" w:lineRule="auto" w:line="276"/>
-        <w:ind w:left="0" w:right="0" w:firstLine="0"/>
+        <w:ind w:left="0" w:right="0" w:firstLine="720"/>
         <w:jc w:val="left"/>
       </w:pPr>
       <w:r>
@@ -1289,7 +1289,7 @@
     <w:p>
       <w:pPr>
         <w:spacing w:before="0" w:after="0" w:lineRule="auto" w:line="276"/>
-        <w:ind w:left="0" w:right="0" w:firstLine="0"/>
+        <w:ind w:left="0" w:right="0" w:firstLine="720"/>
         <w:jc w:val="left"/>
       </w:pPr>
       <w:r>
@@ -1319,7 +1319,7 @@
     <w:p>
       <w:pPr>
         <w:spacing w:before="0" w:after="0" w:lineRule="auto" w:line="276"/>
-        <w:ind w:left="0" w:right="0" w:firstLine="0"/>
+        <w:ind w:left="0" w:right="0" w:firstLine="720"/>
         <w:jc w:val="left"/>
       </w:pPr>
       <w:r>
@@ -1334,7 +1334,7 @@
     <w:p>
       <w:pPr>
         <w:spacing w:before="0" w:after="0" w:lineRule="auto" w:line="276"/>
-        <w:ind w:left="0" w:right="0" w:firstLine="0"/>
+        <w:ind w:left="0" w:right="0" w:firstLine="720"/>
         <w:jc w:val="left"/>
       </w:pPr>
       <w:r>
@@ -1349,7 +1349,7 @@
     <w:p>
       <w:pPr>
         <w:spacing w:before="0" w:after="0" w:lineRule="auto" w:line="276"/>
-        <w:ind w:left="0" w:right="0" w:firstLine="0"/>
+        <w:ind w:left="0" w:right="0" w:firstLine="720"/>
         <w:jc w:val="left"/>
       </w:pPr>
       <w:r>
@@ -1364,7 +1364,7 @@
     <w:p>
       <w:pPr>
         <w:spacing w:before="0" w:after="0" w:lineRule="auto" w:line="276"/>
-        <w:ind w:left="0" w:right="0" w:firstLine="0"/>
+        <w:ind w:left="0" w:right="0" w:firstLine="720"/>
         <w:jc w:val="left"/>
       </w:pPr>
       <w:r>
@@ -1380,7 +1380,7 @@
     <w:p>
       <w:pPr>
         <w:spacing w:before="0" w:after="0" w:lineRule="auto" w:line="276"/>
-        <w:ind w:left="0" w:right="0" w:firstLine="0"/>
+        <w:ind w:left="0" w:right="0" w:firstLine="720"/>
         <w:jc w:val="left"/>
       </w:pPr>
       <w:r>
@@ -1395,7 +1395,7 @@
     <w:p>
       <w:pPr>
         <w:spacing w:before="0" w:after="0" w:lineRule="auto" w:line="276"/>
-        <w:ind w:left="0" w:right="0" w:firstLine="0"/>
+        <w:ind w:left="0" w:right="0" w:firstLine="720"/>
         <w:jc w:val="left"/>
       </w:pPr>
       <w:r>
@@ -1410,7 +1410,7 @@
     <w:p>
       <w:pPr>
         <w:spacing w:before="0" w:after="0" w:lineRule="auto" w:line="276"/>
-        <w:ind w:left="0" w:right="0" w:firstLine="0"/>
+        <w:ind w:left="0" w:right="0" w:firstLine="720"/>
         <w:jc w:val="left"/>
       </w:pPr>
       <w:r>
@@ -1425,7 +1425,7 @@
     <w:p>
       <w:pPr>
         <w:spacing w:before="0" w:after="0" w:lineRule="auto" w:line="276"/>
-        <w:ind w:left="0" w:right="0" w:firstLine="0"/>
+        <w:ind w:left="0" w:right="0" w:firstLine="720"/>
         <w:jc w:val="left"/>
       </w:pPr>
       <w:r>
@@ -1440,7 +1440,7 @@
     <w:p>
       <w:pPr>
         <w:spacing w:before="0" w:after="0" w:lineRule="auto" w:line="276"/>
-        <w:ind w:left="0" w:right="0" w:firstLine="0"/>
+        <w:ind w:left="0" w:right="0" w:firstLine="720"/>
         <w:jc w:val="left"/>
       </w:pPr>
       <w:r>
@@ -1455,7 +1455,7 @@
     <w:p>
       <w:pPr>
         <w:spacing w:before="0" w:after="0" w:lineRule="auto" w:line="276"/>
-        <w:ind w:left="0" w:right="0" w:firstLine="0"/>
+        <w:ind w:left="0" w:right="0" w:firstLine="720"/>
         <w:jc w:val="left"/>
       </w:pPr>
       <w:r>
@@ -1470,7 +1470,7 @@
     <w:p>
       <w:pPr>
         <w:spacing w:before="0" w:after="0" w:lineRule="auto" w:line="276"/>
-        <w:ind w:left="0" w:right="0" w:firstLine="0"/>
+        <w:ind w:left="0" w:right="0" w:firstLine="720"/>
         <w:jc w:val="left"/>
       </w:pPr>
       <w:r>
@@ -1502,7 +1502,7 @@
     <w:p>
       <w:pPr>
         <w:spacing w:before="0" w:after="0" w:lineRule="auto" w:line="276"/>
-        <w:ind w:left="0" w:right="0" w:firstLine="0"/>
+        <w:ind w:left="0" w:right="0" w:firstLine="720"/>
         <w:jc w:val="left"/>
       </w:pPr>
       <w:r>
@@ -1517,7 +1517,7 @@
     <w:p>
       <w:pPr>
         <w:spacing w:before="0" w:after="0" w:lineRule="auto" w:line="276"/>
-        <w:ind w:left="0" w:right="0" w:firstLine="0"/>
+        <w:ind w:left="0" w:right="0" w:firstLine="720"/>
         <w:jc w:val="left"/>
       </w:pPr>
       <w:r>
@@ -1532,7 +1532,7 @@
     <w:p>
       <w:pPr>
         <w:spacing w:before="0" w:after="0" w:lineRule="auto" w:line="276"/>
-        <w:ind w:left="0" w:right="0" w:firstLine="0"/>
+        <w:ind w:left="0" w:right="0" w:firstLine="720"/>
         <w:jc w:val="left"/>
       </w:pPr>
       <w:r>
@@ -1547,7 +1547,7 @@
     <w:p>
       <w:pPr>
         <w:spacing w:before="0" w:after="0" w:lineRule="auto" w:line="276"/>
-        <w:ind w:left="0" w:right="0" w:firstLine="0"/>
+        <w:ind w:left="0" w:right="0" w:firstLine="720"/>
         <w:jc w:val="left"/>
       </w:pPr>
       <w:r>
@@ -1562,7 +1562,7 @@
     <w:p>
       <w:pPr>
         <w:spacing w:before="0" w:after="0" w:lineRule="auto" w:line="276"/>
-        <w:ind w:left="0" w:right="0" w:firstLine="0"/>
+        <w:ind w:left="0" w:right="0" w:firstLine="720"/>
         <w:jc w:val="left"/>
       </w:pPr>
       <w:r>
@@ -1577,7 +1577,7 @@
     <w:p>
       <w:pPr>
         <w:spacing w:before="0" w:after="0" w:lineRule="auto" w:line="276"/>
-        <w:ind w:left="0" w:right="0" w:firstLine="0"/>
+        <w:ind w:left="0" w:right="0" w:firstLine="720"/>
         <w:jc w:val="left"/>
       </w:pPr>
       <w:r>
@@ -1592,7 +1592,7 @@
     <w:p>
       <w:pPr>
         <w:spacing w:before="0" w:after="0" w:lineRule="auto" w:line="276"/>
-        <w:ind w:left="0" w:right="0" w:firstLine="0"/>
+        <w:ind w:left="0" w:right="0" w:firstLine="720"/>
         <w:jc w:val="left"/>
       </w:pPr>
       <w:r>
@@ -1641,7 +1641,7 @@
     <w:p>
       <w:pPr>
         <w:spacing w:before="0" w:after="0" w:lineRule="auto" w:line="276"/>
-        <w:ind w:left="0" w:right="0" w:firstLine="0"/>
+        <w:ind w:left="0" w:right="0" w:firstLine="720"/>
         <w:jc w:val="left"/>
       </w:pPr>
       <w:r>
@@ -1656,7 +1656,7 @@
     <w:p>
       <w:pPr>
         <w:spacing w:before="0" w:after="0" w:lineRule="auto" w:line="276"/>
-        <w:ind w:left="0" w:right="0" w:firstLine="0"/>
+        <w:ind w:left="0" w:right="0" w:firstLine="720"/>
         <w:jc w:val="left"/>
       </w:pPr>
       <w:r>
@@ -1671,7 +1671,7 @@
     <w:p>
       <w:pPr>
         <w:spacing w:before="0" w:after="0" w:lineRule="auto" w:line="276"/>
-        <w:ind w:left="0" w:right="0" w:firstLine="0"/>
+        <w:ind w:left="0" w:right="0" w:firstLine="720"/>
         <w:jc w:val="left"/>
       </w:pPr>
       <w:r>
@@ -1686,7 +1686,7 @@
     <w:p>
       <w:pPr>
         <w:spacing w:before="0" w:after="0" w:lineRule="auto" w:line="276"/>
-        <w:ind w:left="0" w:right="0" w:firstLine="0"/>
+        <w:ind w:left="0" w:right="0" w:firstLine="720"/>
         <w:jc w:val="left"/>
       </w:pPr>
       <w:r>
@@ -1718,7 +1718,7 @@
     <w:p>
       <w:pPr>
         <w:spacing w:before="0" w:after="0" w:lineRule="auto" w:line="276"/>
-        <w:ind w:left="0" w:right="0" w:firstLine="0"/>
+        <w:ind w:left="0" w:right="0" w:firstLine="720"/>
         <w:jc w:val="left"/>
       </w:pPr>
       <w:r>
@@ -1750,7 +1750,7 @@
     <w:p>
       <w:pPr>
         <w:spacing w:before="0" w:after="0" w:lineRule="auto" w:line="276"/>
-        <w:ind w:left="0" w:right="0" w:firstLine="0"/>
+        <w:ind w:left="0" w:right="0" w:firstLine="720"/>
         <w:jc w:val="left"/>
       </w:pPr>
       <w:r>
@@ -1765,7 +1765,7 @@
     <w:p>
       <w:pPr>
         <w:spacing w:before="0" w:after="0" w:lineRule="auto" w:line="276"/>
-        <w:ind w:left="0" w:right="0" w:firstLine="0"/>
+        <w:ind w:left="0" w:right="0" w:firstLine="720"/>
         <w:jc w:val="left"/>
       </w:pPr>
       <w:r>
@@ -1780,7 +1780,7 @@
     <w:p>
       <w:pPr>
         <w:spacing w:before="0" w:after="0" w:lineRule="auto" w:line="276"/>
-        <w:ind w:left="0" w:right="0" w:firstLine="0"/>
+        <w:ind w:left="0" w:right="0" w:firstLine="720"/>
         <w:jc w:val="left"/>
       </w:pPr>
       <w:r>
@@ -1795,7 +1795,7 @@
     <w:p>
       <w:pPr>
         <w:spacing w:before="0" w:after="0" w:lineRule="auto" w:line="276"/>
-        <w:ind w:left="0" w:right="0" w:firstLine="0"/>
+        <w:ind w:left="0" w:right="0" w:firstLine="720"/>
         <w:jc w:val="left"/>
       </w:pPr>
       <w:r>
@@ -1810,7 +1810,7 @@
     <w:p>
       <w:pPr>
         <w:spacing w:before="0" w:after="0" w:lineRule="auto" w:line="276"/>
-        <w:ind w:left="0" w:right="0" w:firstLine="0"/>
+        <w:ind w:left="0" w:right="0" w:firstLine="720"/>
         <w:jc w:val="left"/>
       </w:pPr>
       <w:r>
@@ -1825,7 +1825,7 @@
     <w:p>
       <w:pPr>
         <w:spacing w:before="0" w:after="0" w:lineRule="auto" w:line="276"/>
-        <w:ind w:left="0" w:right="0" w:firstLine="0"/>
+        <w:ind w:left="0" w:right="0" w:firstLine="720"/>
         <w:jc w:val="left"/>
       </w:pPr>
       <w:r>
@@ -1840,7 +1840,7 @@
     <w:p>
       <w:pPr>
         <w:spacing w:before="0" w:after="0" w:lineRule="auto" w:line="276"/>
-        <w:ind w:left="0" w:right="0" w:firstLine="0"/>
+        <w:ind w:left="0" w:right="0" w:firstLine="720"/>
         <w:jc w:val="left"/>
       </w:pPr>
       <w:r>
@@ -1855,7 +1855,7 @@
     <w:p>
       <w:pPr>
         <w:spacing w:before="0" w:after="0" w:lineRule="auto" w:line="276"/>
-        <w:ind w:left="0" w:right="0" w:firstLine="0"/>
+        <w:ind w:left="0" w:right="0" w:firstLine="720"/>
         <w:jc w:val="left"/>
       </w:pPr>
       <w:r>
@@ -1870,7 +1870,7 @@
     <w:p>
       <w:pPr>
         <w:spacing w:before="0" w:after="0" w:lineRule="auto" w:line="276"/>
-        <w:ind w:left="0" w:right="0" w:firstLine="0"/>
+        <w:ind w:left="0" w:right="0" w:firstLine="720"/>
         <w:jc w:val="left"/>
       </w:pPr>
       <w:r>
@@ -1885,7 +1885,7 @@
     <w:p>
       <w:pPr>
         <w:spacing w:before="0" w:after="0" w:lineRule="auto" w:line="276"/>
-        <w:ind w:left="0" w:right="0" w:firstLine="0"/>
+        <w:ind w:left="0" w:right="0" w:firstLine="720"/>
         <w:jc w:val="left"/>
       </w:pPr>
       <w:r>
@@ -1900,7 +1900,7 @@
     <w:p>
       <w:pPr>
         <w:spacing w:before="0" w:after="0" w:lineRule="auto" w:line="276"/>
-        <w:ind w:left="0" w:right="0" w:firstLine="0"/>
+        <w:ind w:left="0" w:right="0" w:firstLine="720"/>
         <w:jc w:val="left"/>
       </w:pPr>
       <w:r>
@@ -1915,7 +1915,7 @@
     <w:p>
       <w:pPr>
         <w:spacing w:before="0" w:after="0" w:lineRule="auto" w:line="276"/>
-        <w:ind w:left="0" w:right="0" w:firstLine="0"/>
+        <w:ind w:left="0" w:right="0" w:firstLine="720"/>
         <w:jc w:val="left"/>
       </w:pPr>
       <w:r>
@@ -1945,7 +1945,7 @@
     <w:p>
       <w:pPr>
         <w:spacing w:before="0" w:after="0" w:lineRule="auto" w:line="276"/>
-        <w:ind w:left="0" w:right="0" w:firstLine="0"/>
+        <w:ind w:left="0" w:right="0" w:firstLine="720"/>
         <w:jc w:val="left"/>
       </w:pPr>
       <w:r>
@@ -1960,7 +1960,7 @@
     <w:p>
       <w:pPr>
         <w:spacing w:before="0" w:after="0" w:lineRule="auto" w:line="276"/>
-        <w:ind w:left="0" w:right="0" w:firstLine="0"/>
+        <w:ind w:left="0" w:right="0" w:firstLine="720"/>
         <w:jc w:val="left"/>
       </w:pPr>
       <w:r>
@@ -1975,7 +1975,7 @@
     <w:p>
       <w:pPr>
         <w:spacing w:before="0" w:after="0" w:lineRule="auto" w:line="276"/>
-        <w:ind w:left="0" w:right="0" w:firstLine="0"/>
+        <w:ind w:left="0" w:right="0" w:firstLine="720"/>
         <w:jc w:val="left"/>
       </w:pPr>
       <w:r>
@@ -1990,7 +1990,7 @@
     <w:p>
       <w:pPr>
         <w:spacing w:before="0" w:after="0" w:lineRule="auto" w:line="276"/>
-        <w:ind w:left="0" w:right="0" w:firstLine="0"/>
+        <w:ind w:left="0" w:right="0" w:firstLine="720"/>
         <w:jc w:val="left"/>
       </w:pPr>
       <w:r>
@@ -2005,7 +2005,7 @@
     <w:p>
       <w:pPr>
         <w:spacing w:before="0" w:after="0" w:lineRule="auto" w:line="276"/>
-        <w:ind w:left="0" w:right="0" w:firstLine="0"/>
+        <w:ind w:left="0" w:right="0" w:firstLine="720"/>
         <w:jc w:val="left"/>
       </w:pPr>
       <w:r>
@@ -2020,7 +2020,7 @@
     <w:p>
       <w:pPr>
         <w:spacing w:before="0" w:after="0" w:lineRule="auto" w:line="276"/>
-        <w:ind w:left="0" w:right="0" w:firstLine="0"/>
+        <w:ind w:left="0" w:right="0" w:firstLine="720"/>
         <w:jc w:val="left"/>
       </w:pPr>
       <w:r>
@@ -2035,7 +2035,7 @@
     <w:p>
       <w:pPr>
         <w:spacing w:before="0" w:after="0" w:lineRule="auto" w:line="276"/>
-        <w:ind w:left="0" w:right="0" w:firstLine="0"/>
+        <w:ind w:left="0" w:right="0" w:firstLine="720"/>
         <w:jc w:val="left"/>
       </w:pPr>
       <w:r>
@@ -2050,7 +2050,7 @@
     <w:p>
       <w:pPr>
         <w:spacing w:before="0" w:after="0" w:lineRule="auto" w:line="276"/>
-        <w:ind w:left="0" w:right="0" w:firstLine="0"/>
+        <w:ind w:left="0" w:right="0" w:firstLine="720"/>
         <w:jc w:val="left"/>
       </w:pPr>
       <w:r>
@@ -2065,7 +2065,7 @@
     <w:p>
       <w:pPr>
         <w:spacing w:before="0" w:after="0" w:lineRule="auto" w:line="276"/>
-        <w:ind w:left="0" w:right="0" w:firstLine="0"/>
+        <w:ind w:left="0" w:right="0" w:firstLine="720"/>
         <w:jc w:val="left"/>
       </w:pPr>
       <w:r>
@@ -2080,7 +2080,7 @@
     <w:p>
       <w:pPr>
         <w:spacing w:before="0" w:after="0" w:lineRule="auto" w:line="276"/>
-        <w:ind w:left="0" w:right="0" w:firstLine="0"/>
+        <w:ind w:left="0" w:right="0" w:firstLine="720"/>
         <w:jc w:val="left"/>
       </w:pPr>
       <w:r>
@@ -2095,7 +2095,7 @@
     <w:p>
       <w:pPr>
         <w:spacing w:before="0" w:after="0" w:lineRule="auto" w:line="276"/>
-        <w:ind w:left="0" w:right="0" w:firstLine="0"/>
+        <w:ind w:left="0" w:right="0" w:firstLine="720"/>
         <w:jc w:val="left"/>
       </w:pPr>
       <w:r>
@@ -2110,7 +2110,7 @@
     <w:p>
       <w:pPr>
         <w:spacing w:before="0" w:after="0" w:lineRule="auto" w:line="276"/>
-        <w:ind w:left="0" w:right="0" w:firstLine="0"/>
+        <w:ind w:left="0" w:right="0" w:firstLine="720"/>
         <w:jc w:val="left"/>
       </w:pPr>
       <w:r>
@@ -2125,7 +2125,7 @@
     <w:p>
       <w:pPr>
         <w:spacing w:before="0" w:after="0" w:lineRule="auto" w:line="276"/>
-        <w:ind w:left="0" w:right="0" w:firstLine="0"/>
+        <w:ind w:left="0" w:right="0" w:firstLine="720"/>
         <w:jc w:val="left"/>
       </w:pPr>
       <w:r>
@@ -2140,7 +2140,7 @@
     <w:p>
       <w:pPr>
         <w:spacing w:before="0" w:after="0" w:lineRule="auto" w:line="276"/>
-        <w:ind w:left="0" w:right="0" w:firstLine="0"/>
+        <w:ind w:left="0" w:right="0" w:firstLine="720"/>
         <w:jc w:val="left"/>
       </w:pPr>
       <w:r>
@@ -2155,7 +2155,7 @@
     <w:p>
       <w:pPr>
         <w:spacing w:before="0" w:after="0" w:lineRule="auto" w:line="276"/>
-        <w:ind w:left="0" w:right="0" w:firstLine="0"/>
+        <w:ind w:left="0" w:right="0" w:firstLine="720"/>
         <w:jc w:val="left"/>
       </w:pPr>
       <w:r>
@@ -2170,7 +2170,7 @@
     <w:p>
       <w:pPr>
         <w:spacing w:before="0" w:after="0" w:lineRule="auto" w:line="276"/>
-        <w:ind w:left="0" w:right="0" w:firstLine="0"/>
+        <w:ind w:left="0" w:right="0" w:firstLine="720"/>
         <w:jc w:val="left"/>
       </w:pPr>
       <w:r>
@@ -2185,7 +2185,7 @@
     <w:p>
       <w:pPr>
         <w:spacing w:before="0" w:after="0" w:lineRule="auto" w:line="276"/>
-        <w:ind w:left="0" w:right="0" w:firstLine="0"/>
+        <w:ind w:left="0" w:right="0" w:firstLine="720"/>
         <w:jc w:val="left"/>
       </w:pPr>
       <w:r>
@@ -2200,7 +2200,7 @@
     <w:p>
       <w:pPr>
         <w:spacing w:before="0" w:after="0" w:lineRule="auto" w:line="276"/>
-        <w:ind w:left="0" w:right="0" w:firstLine="0"/>
+        <w:ind w:left="0" w:right="0" w:firstLine="720"/>
         <w:jc w:val="left"/>
       </w:pPr>
       <w:r>

</xml_diff>

<commit_message>
Ch7: author's night scene plus Silas's morning (Teo, Pell, Remy); curly quotes in formatter; author Draft 2 reference
Co-Authored-By: Claude Opus 5.5 <noreply@anthropic.com>
Claude-Session: https://claude.ai/code/session_01Vza9ZbwsuDNV7dNpAiGb3h
</commit_message>
<xml_diff>
--- a/drafts/3SL_Chapter_7.docx
+++ b/drafts/3SL_Chapter_7.docx
@@ -30,7 +30,7 @@
           <w:color w:val="000000"/>
           <w:sz w:val="24"/>
         </w:rPr>
-        <w:t>Mother Rae came up the steps of the dark house a little after two in the morning, and Silas heard her bells before he heard the door.</w:t>
+        <w:t>Mother Rae came up the steps of the dark house a little after two in the morning, and Silas heard her bells before he heard the door. Camille didn’t get up from the kitchen table. She turned a page of her crossword.</w:t>
       </w:r>
     </w:p>
     <w:p>
@@ -45,7 +45,7 @@
           <w:color w:val="000000"/>
           <w:sz w:val="24"/>
         </w:rPr>
-        <w:t>He'd never heard them ring before. He'd seen her at the Ring, in Dante's office, and at more funerals than he could count, standing in the back row with her hands folded while everybody else did the crying, and those bells had never made a sound. Tonight they rang once on the step outside, three small notes, and every thread Camille had sewn across that house went tight at the same time.</w:t>
+        <w:t>“Took you long enough,” she said, before the door was all the way open.</w:t>
       </w:r>
     </w:p>
     <w:p>
@@ -60,37 +60,7 @@
           <w:color w:val="000000"/>
           <w:sz w:val="24"/>
         </w:rPr>
-        <w:t>Camille didn't get up from the kitchen table. She turned a page of her crossword.</w:t>
-      </w:r>
-    </w:p>
-    <w:p>
-      <w:pPr>
-        <w:spacing w:before="0" w:after="0" w:lineRule="auto" w:line="276"/>
-        <w:ind w:left="0" w:right="0" w:firstLine="720"/>
-        <w:jc w:val="left"/>
-      </w:pPr>
-      <w:r>
-        <w:rPr>
-          <w:rFonts w:ascii="Times New Roman" w:hAnsi="Times New Roman" w:cs="Times New Roman" w:eastAsia="Times New Roman"/>
-          <w:color w:val="000000"/>
-          <w:sz w:val="24"/>
-        </w:rPr>
-        <w:t>"Took you long enough," she said, before the door was all the way open.</w:t>
-      </w:r>
-    </w:p>
-    <w:p>
-      <w:pPr>
-        <w:spacing w:before="0" w:after="0" w:lineRule="auto" w:line="276"/>
-        <w:ind w:left="0" w:right="0" w:firstLine="720"/>
-        <w:jc w:val="left"/>
-      </w:pPr>
-      <w:r>
-        <w:rPr>
-          <w:rFonts w:ascii="Times New Roman" w:hAnsi="Times New Roman" w:cs="Times New Roman" w:eastAsia="Times New Roman"/>
-          <w:color w:val="000000"/>
-          <w:sz w:val="24"/>
-        </w:rPr>
-        <w:t>Rae came in out of the rain with Remy behind her. She was dressed the way she was always dressed, black from her throat to her ankles, silver at her wrist, not a drop of water on her anywhere, like the rain had asked permission and she'd said no. Remy was the one who looked like he'd walked through the storm. He was soaked to the knees, his locs falling out of their tie, and he came through the door with his eyes already moving around the room the way they did when he was counting exits.</w:t>
+        <w:t>Rae came in out of the rain with Remy behind her. She was dressed the way she always was: black from her throat to her ankles, silver at her wrist, not a drop of water anywhere, like the rain had asked permission and she’d said no. Remy was the one who looked like he’d walked through the storm. He was soaked to the knees, his locs falling out of their tie. He came through the door with his eyes already moving around the room the way they did when he was counting exits.</w:t>
       </w:r>
     </w:p>
     <w:p>
@@ -120,7 +90,7 @@
           <w:color w:val="000000"/>
           <w:sz w:val="24"/>
         </w:rPr>
-        <w:t>She was still at the table where Camille had left her, both hands flat on the wood, the black under her nails sitting past the first knuckle on three fingers. When Rae stepped into the kitchen light, Melena stood up so fast her chair went over.</w:t>
+        <w:t>She was still at the table where Camille had left her, both hands flat on the wood. When Rae stepped into the kitchen light, Melena stood up so fast her chair went over.</w:t>
       </w:r>
     </w:p>
     <w:p>
@@ -135,7 +105,7 @@
           <w:color w:val="000000"/>
           <w:sz w:val="24"/>
         </w:rPr>
-        <w:t>"Maven," she said.</w:t>
+        <w:t>“Maven,” she said.</w:t>
       </w:r>
     </w:p>
     <w:p>
@@ -165,7 +135,7 @@
           <w:color w:val="000000"/>
           <w:sz w:val="24"/>
         </w:rPr>
-        <w:t>Rae didn't answer her. She looked at the chair on its back, then at the melted lock down the hall, then at Silas's hand wrapped in Camille's cloth with the blister weeping through it. She looked at all of it the way she'd looked at Jerrick from the platform two nights ago, without giving anybody a single thing to read.</w:t>
+        <w:t>“Sit down,” she said to Melena. “You’re letting the heat out.”</w:t>
       </w:r>
     </w:p>
     <w:p>
@@ -180,7 +150,7 @@
           <w:color w:val="000000"/>
           <w:sz w:val="24"/>
         </w:rPr>
-        <w:t>"Sit down, baby," she said to Melena. "You're letting the heat out."</w:t>
+        <w:t>Melena picked the chair up and sat on the very edge of it like she was in somebody’s church. Rae took the chair across from Camille. Nobody had offered it to her. Nobody had to.</w:t>
       </w:r>
     </w:p>
     <w:p>
@@ -195,7 +165,7 @@
           <w:color w:val="000000"/>
           <w:sz w:val="24"/>
         </w:rPr>
-        <w:t>Melena sat. She picked the chair up first, carefully, and set it back on its legs, and sat on the very edge of it like she was in somebody's church.</w:t>
+        <w:t>“Camille Louise,” she said.</w:t>
       </w:r>
     </w:p>
     <w:p>
@@ -210,7 +180,7 @@
           <w:color w:val="000000"/>
           <w:sz w:val="24"/>
         </w:rPr>
-        <w:t>Rae took the chair across from Camille. Nobody had offered it to her. She didn't need anybody to.</w:t>
+        <w:t>“Maven Renae.” Camille set her pencil down on the crossword and folded her hands on top of it. “I’m going to ask you some questions, and you’re going to answer them, because that’s my thread on that door and that’s my son’s hand on this table.”</w:t>
       </w:r>
     </w:p>
     <w:p>
@@ -225,7 +195,7 @@
           <w:color w:val="000000"/>
           <w:sz w:val="24"/>
         </w:rPr>
-        <w:t>"Camille," she said.</w:t>
+        <w:t>Rae didn’t blink. “Ask.”</w:t>
       </w:r>
     </w:p>
     <w:p>
@@ -240,7 +210,7 @@
           <w:color w:val="000000"/>
           <w:sz w:val="24"/>
         </w:rPr>
-        <w:t>"Renae." Camille set her pencil down on the crossword and folded her hands on top of it. "I'm going to ask you some questions, and you're going to answer them, because that's my thread on that door and that's my son's hand on this table."</w:t>
+        <w:t>“Who is she?”</w:t>
       </w:r>
     </w:p>
     <w:p>
@@ -255,7 +225,7 @@
           <w:color w:val="000000"/>
           <w:sz w:val="24"/>
         </w:rPr>
-        <w:t>Rae didn't blink. "Ask."</w:t>
+        <w:t>Rae smoothed one black sleeve against her wrist. “Lucia’s girl.”</w:t>
       </w:r>
     </w:p>
     <w:p>
@@ -270,7 +240,7 @@
           <w:color w:val="000000"/>
           <w:sz w:val="24"/>
         </w:rPr>
-        <w:t>"Who is she?"</w:t>
+        <w:t>“I don’t know no Lucia,” Camille said, and her pencil tapped once against the paper.</w:t>
       </w:r>
     </w:p>
     <w:p>
@@ -285,7 +255,7 @@
           <w:color w:val="000000"/>
           <w:sz w:val="24"/>
         </w:rPr>
-        <w:t>Rae smoothed one black sleeve against her wrist. "Lucia's girl."</w:t>
+        <w:t>“I know you don’t.” Rae’s hands stayed folded. “Kinda the point, ain’t it?”</w:t>
       </w:r>
     </w:p>
     <w:p>
@@ -300,7 +270,7 @@
           <w:color w:val="000000"/>
           <w:sz w:val="24"/>
         </w:rPr>
-        <w:t>"I don't know no Lucia," Camille said, and her pencil tapped once against the paper.</w:t>
+        <w:t>Camille’s jaw twitched. Silas had seen grown men leave rooms over less than that jaw. “She walked through three Graves knots like they were wet paper. My thread don’t break, Renae. It’s held the dead off this whole street for twenty years. Shrouds walk past this house and don’t look at the door. And she went through it in her sleep.”</w:t>
       </w:r>
     </w:p>
     <w:p>
@@ -315,7 +285,7 @@
           <w:color w:val="000000"/>
           <w:sz w:val="24"/>
         </w:rPr>
-        <w:t>"I know you don't." Rae's hands stayed folded. "That's the point."</w:t>
+        <w:t>Rae glanced down the hall at the brass running down the door. “She wasn’t asleep.”</w:t>
       </w:r>
     </w:p>
     <w:p>
@@ -330,37 +300,7 @@
           <w:color w:val="000000"/>
           <w:sz w:val="24"/>
         </w:rPr>
-        <w:t>Camille's jaw moved once. Silas had seen grown men leave rooms over less than that jaw. "She walked through three Graves knots like they were wet paper. My thread don't break, Renae. It's held the dead off this whole street for twenty years. Shrouds walk past this house and don't look at the door. And she went through it in her sleep."</w:t>
-      </w:r>
-    </w:p>
-    <w:p>
-      <w:pPr>
-        <w:spacing w:before="0" w:after="0" w:lineRule="auto" w:line="276"/>
-        <w:ind w:left="0" w:right="0" w:firstLine="720"/>
-        <w:jc w:val="left"/>
-      </w:pPr>
-      <w:r>
-        <w:rPr>
-          <w:rFonts w:ascii="Times New Roman" w:hAnsi="Times New Roman" w:cs="Times New Roman" w:eastAsia="Times New Roman"/>
-          <w:color w:val="000000"/>
-          <w:sz w:val="24"/>
-        </w:rPr>
-        <w:t>Rae glanced down the hall at the brass running down the door. "She wasn't asleep."</w:t>
-      </w:r>
-    </w:p>
-    <w:p>
-      <w:pPr>
-        <w:spacing w:before="0" w:after="0" w:lineRule="auto" w:line="276"/>
-        <w:ind w:left="0" w:right="0" w:firstLine="720"/>
-        <w:jc w:val="left"/>
-      </w:pPr>
-      <w:r>
-        <w:rPr>
-          <w:rFonts w:ascii="Times New Roman" w:hAnsi="Times New Roman" w:cs="Times New Roman" w:eastAsia="Times New Roman"/>
-          <w:color w:val="000000"/>
-          <w:sz w:val="24"/>
-        </w:rPr>
-        <w:t xml:space="preserve">"I don't care if she was dancing." Camille leaned forward. "What </w:t>
+        <w:t xml:space="preserve">“I don’t care if she was dancing.” Camille leaned forward. “What </w:t>
       </w:r>
       <w:r>
         <w:rPr>
@@ -377,7 +317,7 @@
           <w:color w:val="000000"/>
           <w:sz w:val="24"/>
         </w:rPr>
-        <w:t xml:space="preserve"> she?"</w:t>
+        <w:t xml:space="preserve"> she?”</w:t>
       </w:r>
     </w:p>
     <w:p>
@@ -392,7 +332,7 @@
           <w:color w:val="000000"/>
           <w:sz w:val="24"/>
         </w:rPr>
-        <w:t>Rae looked at Melena for a long moment. Melena held her eyes, and the air over the table warmed by a degree, and Rae looked back at Camille.</w:t>
+        <w:t>Rae looked at Melena for a long moment. Melena held her eyes, and the air over the table warmed by a degree. Rae looked back at Camille.</w:t>
       </w:r>
     </w:p>
     <w:p>
@@ -407,7 +347,7 @@
           <w:color w:val="000000"/>
           <w:sz w:val="24"/>
         </w:rPr>
-        <w:t>"Grieving," Rae said.</w:t>
+        <w:t>“Grieving,” Rae said.</w:t>
       </w:r>
     </w:p>
     <w:p>
@@ -422,7 +362,7 @@
           <w:color w:val="000000"/>
           <w:sz w:val="24"/>
         </w:rPr>
-        <w:t>Camille sat back and crossed her arms. "That ain't an answer."</w:t>
+        <w:t>Camille sat back and crossed her arms. “That ain’t an answer.”</w:t>
       </w:r>
     </w:p>
     <w:p>
@@ -437,7 +377,7 @@
           <w:color w:val="000000"/>
           <w:sz w:val="24"/>
         </w:rPr>
-        <w:t>"It's the only one that matters tonight," Rae said, without looking away from the girl.</w:t>
+        <w:t>“It’s the only one that matters tonight,” Rae said, without looking away from the girl. “Everything else you don’t need to know. I can promise you that.”</w:t>
       </w:r>
     </w:p>
     <w:p>
@@ -452,7 +392,7 @@
           <w:color w:val="000000"/>
           <w:sz w:val="24"/>
         </w:rPr>
-        <w:t>Silas watched his mother take that. She took it the way she'd take a bad cut of meat from the butcher, holding it up to the light and turning it over and deciding exactly how she was going to make him regret selling it to her.</w:t>
+        <w:t>“So now you’re telling me what I need to know?” Camille asked. “I know my husband’s been in his map room every night since spring with the seal burning blue. I know you’ve been walking in and out of that building like you pay rent on it. I know Lorraine’s counting watchers on the front steps she didn’t used to count. Quietcasters walking the edges of your routes, and Dante came home last week and slept in his shoes.” She tapped the crossword once with one finger. “And now he hands my son a girl the Synod’s hunting, puts her in my house behind my ward, and doesn’t tell me a single word. I had to find out when my thread snapped. I came across Gutterlight in my house shoes. You of all people know how I feel about my damn house shoes.”</w:t>
       </w:r>
     </w:p>
     <w:p>
@@ -467,7 +407,7 @@
           <w:color w:val="000000"/>
           <w:sz w:val="24"/>
         </w:rPr>
-        <w:t>"So let me tell you what I know," Camille said. "I know my husband's been in his map room every night since spring with the seal burning blue. I know you've been walking in and out of that building like you pay rent on it. I know Lorraine's counting watchers on the front steps she didn't used to count, and Quietcasters walking the edges of your routes, and Dante came home last week and slept in his shoes." She tapped the crossword once with one finger. "And now he hands my son a girl the Synod's hunting, puts her in my house behind my ward, and doesn't tell me a single word. Not one. I had to find out when my thread snapped and I came across Gutterlight in my house shoes."</w:t>
+        <w:t>“I saw the shoes,” Rae said.</w:t>
       </w:r>
     </w:p>
     <w:p>
@@ -482,7 +422,7 @@
           <w:color w:val="000000"/>
           <w:sz w:val="24"/>
         </w:rPr>
-        <w:t>"I saw the shoes," Rae said.</w:t>
+        <w:t>“Don’t.” Camille’s voice didn’t get louder. It got lower, which was worse. “Don’t you sit at my table and get cute with me, Maven Renae Vellum. I’ve known you since before your boy could walk. I’ve known Dante longer than that. Whatever you two are doing, you did it without me, and now it’s sitting in my kitchen with fire coming out of her hands.”</w:t>
       </w:r>
     </w:p>
     <w:p>
@@ -497,7 +437,7 @@
           <w:color w:val="000000"/>
           <w:sz w:val="24"/>
         </w:rPr>
-        <w:t>"Don't." Camille's voice didn't get louder. It got lower, which was worse. "Don't you sit at my table and get cute with me, Renae Vellum. I've known you since before your boy could walk. I've known Dante longer than that. Whatever you two are doing, you did it without me, and now it's sitting in my kitchen with fire coming out of her hands."</w:t>
+        <w:t>Remy had moved, Silas noticed. He hadn’t gone to his mother. He’d drifted along the wall until he was near the end of the table, closer to Melena than to anybody else. He’d sat down on the floor with his back to the cold stove and his knees pulled up.</w:t>
       </w:r>
     </w:p>
     <w:p>
@@ -512,7 +452,7 @@
           <w:color w:val="000000"/>
           <w:sz w:val="24"/>
         </w:rPr>
-        <w:t>Remy had moved, Silas noticed. He hadn't gone to his mother. He'd drifted along the wall until he was near the end of the table, closer to Melena than to anybody else, and he'd sat down on the floor there with his back to the cold stove and his wet knees pulled up.</w:t>
+        <w:t>Melena’s hands had started to smoke.</w:t>
       </w:r>
     </w:p>
     <w:p>
@@ -527,7 +467,7 @@
           <w:color w:val="000000"/>
           <w:sz w:val="24"/>
         </w:rPr>
-        <w:t>Melena's hands had started to smoke.</w:t>
+        <w:t>A thread of grey off the tips of her fingers, curling up toward the lamp. The black had climbed past the second knuckle on her middle finger. She was staring at Rae like she was waiting for Rae to say something, anything, the thing she’d crossed seven tiers to hear.</w:t>
       </w:r>
     </w:p>
     <w:p>
@@ -542,7 +482,7 @@
           <w:color w:val="000000"/>
           <w:sz w:val="24"/>
         </w:rPr>
-        <w:t>Not much. Just a thread of grey off the tips of her fingers, curling up toward the lamp. The black had climbed past the second knuckle on her middle finger. She was staring at Rae like she was waiting for Rae to say something, anything, the thing she'd crossed seven tiers to hear.</w:t>
+        <w:t>“You said you’d help me,” Melena said calmly. “My mother said you’d help me. She said find Maven, and Maven would know what to do. You put me in a box and left before I could ask you anything.”</w:t>
       </w:r>
     </w:p>
     <w:p>
@@ -557,7 +497,7 @@
           <w:color w:val="000000"/>
           <w:sz w:val="24"/>
         </w:rPr>
-        <w:t>"You said you'd help me," Melena said. Her voice was very calm. That was what scared Silas. "My mother said you'd help me. She said find Maven, and Maven would know what to do. And you put me in a box and left before I could ask you anything."</w:t>
+        <w:t>Rae’s bells shifted on her wrist without a sound. “I put you in the safest box in Shadowmere.”</w:t>
       </w:r>
     </w:p>
     <w:p>
@@ -572,7 +512,7 @@
           <w:color w:val="000000"/>
           <w:sz w:val="24"/>
         </w:rPr>
-        <w:t>Rae's bells shifted on her wrist without a sound. "I put you in the safest box in Shadowmere."</w:t>
+        <w:t>Melena’s palms pressed flat into the wood, and the grain under them started to darken. “How many times do I have to say that I can’t breathe in it?”</w:t>
       </w:r>
     </w:p>
     <w:p>
@@ -587,24 +527,22 @@
           <w:color w:val="000000"/>
           <w:sz w:val="24"/>
         </w:rPr>
-        <w:t xml:space="preserve">Melena's palms pressed flat into the wood, and the grain under them started to darken. "I couldn't </w:t>
+        <w:t>The lamp over the table flickered. The thread on the doorframe started to hum, high, like a kettle. Silas started to stand, but his palm screamed at him, and he stopped halfway because he didn’t know what he’d do once he was up. He’d broken her rule once, and he’d seen her face after.</w:t>
       </w:r>
-      <w:r>
-        <w:rPr>
-          <w:rFonts w:ascii="Times New Roman" w:hAnsi="Times New Roman" w:cs="Times New Roman" w:eastAsia="Times New Roman"/>
-          <w:i/>
-          <w:color w:val="000000"/>
-          <w:sz w:val="24"/>
-        </w:rPr>
-        <w:t>breathe</w:t>
-      </w:r>
+    </w:p>
+    <w:p>
+      <w:pPr>
+        <w:spacing w:before="0" w:after="0" w:lineRule="auto" w:line="276"/>
+        <w:ind w:left="0" w:right="0" w:firstLine="720"/>
+        <w:jc w:val="left"/>
+      </w:pPr>
       <w:r>
         <w:rPr>
           <w:rFonts w:ascii="Times New Roman" w:hAnsi="Times New Roman" w:cs="Times New Roman" w:eastAsia="Times New Roman"/>
           <w:color w:val="000000"/>
           <w:sz w:val="24"/>
         </w:rPr>
-        <w:t xml:space="preserve"> in it."</w:t>
+        <w:t>Remy reached into his coat. He came out with one of his mints, the cheap kind in silver wrappers he’d carried around since they were nine, and held it up between two fingers in the lamplight, out to the side, where she’d have to turn her head to see it.</w:t>
       </w:r>
     </w:p>
     <w:p>
@@ -619,52 +557,7 @@
           <w:color w:val="000000"/>
           <w:sz w:val="24"/>
         </w:rPr>
-        <w:t>The lamp over the table flickered. The thread on the doorframe started to hum, high, like a kettle. Camille didn't move. Rae didn't move. Silas started to stand, and his palm screamed at him, and he stopped halfway because he didn't know what he'd do once he was up. He'd touched her once tonight. He'd broken her rule once, and he'd seen her face after.</w:t>
-      </w:r>
-    </w:p>
-    <w:p>
-      <w:pPr>
-        <w:spacing w:before="0" w:after="0" w:lineRule="auto" w:line="276"/>
-        <w:ind w:left="0" w:right="0" w:firstLine="720"/>
-        <w:jc w:val="left"/>
-      </w:pPr>
-      <w:r>
-        <w:rPr>
-          <w:rFonts w:ascii="Times New Roman" w:hAnsi="Times New Roman" w:cs="Times New Roman" w:eastAsia="Times New Roman"/>
-          <w:color w:val="000000"/>
-          <w:sz w:val="24"/>
-        </w:rPr>
-        <w:t>Remy reached into his coat.</w:t>
-      </w:r>
-    </w:p>
-    <w:p>
-      <w:pPr>
-        <w:spacing w:before="0" w:after="0" w:lineRule="auto" w:line="276"/>
-        <w:ind w:left="0" w:right="0" w:firstLine="720"/>
-        <w:jc w:val="left"/>
-      </w:pPr>
-      <w:r>
-        <w:rPr>
-          <w:rFonts w:ascii="Times New Roman" w:hAnsi="Times New Roman" w:cs="Times New Roman" w:eastAsia="Times New Roman"/>
-          <w:color w:val="000000"/>
-          <w:sz w:val="24"/>
-        </w:rPr>
-        <w:t>He didn't get up off the floor. He came out with one of his mints, the cheap kind in silver wrappers he'd been carrying around since they were nine, and he held it up between two fingers in the lamplight, out to the side, where she'd have to turn her head to see it.</w:t>
-      </w:r>
-    </w:p>
-    <w:p>
-      <w:pPr>
-        <w:spacing w:before="0" w:after="0" w:lineRule="auto" w:line="276"/>
-        <w:ind w:left="0" w:right="0" w:firstLine="720"/>
-        <w:jc w:val="left"/>
-      </w:pPr>
-      <w:r>
-        <w:rPr>
-          <w:rFonts w:ascii="Times New Roman" w:hAnsi="Times New Roman" w:cs="Times New Roman" w:eastAsia="Times New Roman"/>
-          <w:color w:val="000000"/>
-          <w:sz w:val="24"/>
-        </w:rPr>
-        <w:t>"Hey," he said. "What color is this?"</w:t>
+        <w:t>“Hey,” he said. “What color is this?”</w:t>
       </w:r>
     </w:p>
     <w:p>
@@ -694,7 +587,7 @@
           <w:color w:val="000000"/>
           <w:sz w:val="24"/>
         </w:rPr>
-        <w:t>"Humor me," Remy said. "What color?"</w:t>
+        <w:t>“Humor me,” Remy said. “What color?”</w:t>
       </w:r>
     </w:p>
     <w:p>
@@ -709,7 +602,7 @@
           <w:color w:val="000000"/>
           <w:sz w:val="24"/>
         </w:rPr>
-        <w:t>Her mouth worked before it found the word. "Silver."</w:t>
+        <w:t>Her mouth worked before it found the word. “Silver.”</w:t>
       </w:r>
     </w:p>
     <w:p>
@@ -724,7 +617,7 @@
           <w:color w:val="000000"/>
           <w:sz w:val="24"/>
         </w:rPr>
-        <w:t>"Good. What color's my coat?" He plucked at the wet sleeve.</w:t>
+        <w:t>“Good. What color’s my coat?” He plucked at the wet sleeve.</w:t>
       </w:r>
     </w:p>
     <w:p>
@@ -739,7 +632,7 @@
           <w:color w:val="000000"/>
           <w:sz w:val="24"/>
         </w:rPr>
-        <w:t>She looked at it. "Green."</w:t>
+        <w:t>She looked at it. “Green.”</w:t>
       </w:r>
     </w:p>
     <w:p>
@@ -754,7 +647,7 @@
           <w:color w:val="000000"/>
           <w:sz w:val="24"/>
         </w:rPr>
-        <w:t>"Ugly green. You can say it. What color's his shirt?" He tipped the mint toward Silas, and her eyes followed it there and back.</w:t>
+        <w:t>“Ugly green. You can say it. What color’s his shirt?” He tipped the mint toward Silas, and her eyes followed it there and back.</w:t>
       </w:r>
     </w:p>
     <w:p>
@@ -769,7 +662,7 @@
           <w:color w:val="000000"/>
           <w:sz w:val="24"/>
         </w:rPr>
-        <w:t>"Black," she said.</w:t>
+        <w:t>“Black,” she said.</w:t>
       </w:r>
     </w:p>
     <w:p>
@@ -784,7 +677,7 @@
           <w:color w:val="000000"/>
           <w:sz w:val="24"/>
         </w:rPr>
-        <w:t>"Where are you right now?"</w:t>
+        <w:t>“Where are you right now?”</w:t>
       </w:r>
     </w:p>
     <w:p>
@@ -799,7 +692,7 @@
           <w:color w:val="000000"/>
           <w:sz w:val="24"/>
         </w:rPr>
-        <w:t>Her breath hitched. "A kitchen. A dark house. In Shadowmere."</w:t>
+        <w:t>Her breath hitched. “A kitchen. In Shadowmere.”</w:t>
       </w:r>
     </w:p>
     <w:p>
@@ -814,7 +707,7 @@
           <w:color w:val="000000"/>
           <w:sz w:val="24"/>
         </w:rPr>
-        <w:t>"Good. Who's in the kitchen with you?"</w:t>
+        <w:t>“Good. Who’s in the kitchen with you?”</w:t>
       </w:r>
     </w:p>
     <w:p>
@@ -829,7 +722,7 @@
           <w:color w:val="000000"/>
           <w:sz w:val="24"/>
         </w:rPr>
-        <w:t>"Maven." Her eyes went around the table. "Mrs. Graves. Silas." They came back to him. "You. I don't know your name."</w:t>
+        <w:t>“Maven.” Her eyes went around the table. “Mrs. Graves. Silas.” They came back to him. “You. I don’t know your name.”</w:t>
       </w:r>
     </w:p>
     <w:p>
@@ -844,7 +737,7 @@
           <w:color w:val="000000"/>
           <w:sz w:val="24"/>
         </w:rPr>
-        <w:t>"Remy." He set the mint on the floor between them and left it there. "Put your heels down for me. Flat. Press into the floor like you're trying to push it down a tier."</w:t>
+        <w:t>“Remy.” He set the mint on the floor between them and left it there. “Put your heels down for me. Flat. Press into the floor like you’re trying to push it down a tier.”</w:t>
       </w:r>
     </w:p>
     <w:p>
@@ -859,7 +752,7 @@
           <w:color w:val="000000"/>
           <w:sz w:val="24"/>
         </w:rPr>
-        <w:t>She did. Under the table, Silas watched Rhea's old boots press into the boards.</w:t>
+        <w:t>She did. Under the table, Silas watched Rhea’s old boots press into the boards.</w:t>
       </w:r>
     </w:p>
     <w:p>
@@ -891,7 +784,7 @@
           <w:color w:val="000000"/>
           <w:sz w:val="24"/>
         </w:rPr>
-        <w:t xml:space="preserve"> Six uneven beats, and the same six again, like a heartbeat that couldn't make up its mind. He didn't explain it. He breathed out long while he did it, longer than he breathed in, and after the second round Melena was breathing with him.</w:t>
+        <w:t xml:space="preserve"> Six uneven beats, and the same six again, like a heartbeat that couldn’t make up its mind. He breathed out while he did it and after the second round, Melena was breathing with him.</w:t>
       </w:r>
     </w:p>
     <w:p>
@@ -906,7 +799,7 @@
           <w:color w:val="000000"/>
           <w:sz w:val="24"/>
         </w:rPr>
-        <w:t>The thread on the door went quiet. The smoke off her fingers thinned and stopped. She sat at the table with her heels pressed down and her hands open on the wood, shaking, the black backing down off her knuckles to her nails like water going back down a drain.</w:t>
+        <w:t>The thread on the door went quiet. The smoke off her fingers thinned and stopped.</w:t>
       </w:r>
     </w:p>
     <w:p>
@@ -936,7 +829,7 @@
           <w:color w:val="000000"/>
           <w:sz w:val="24"/>
         </w:rPr>
-        <w:t>He'd sat outside that door for four hours. He'd run her down on Lamp Street and pressed her hands to his chest until his palm blistered. Remy had walked in soaking wet and done it with a mint.</w:t>
+        <w:t>He’d sat outside that door for four hours.</w:t>
       </w:r>
     </w:p>
     <w:p>
@@ -951,7 +844,7 @@
           <w:color w:val="000000"/>
           <w:sz w:val="24"/>
         </w:rPr>
-        <w:t>Silas sat back down. He didn't know what he felt about it, so he looked at Rae instead.</w:t>
+        <w:t>Silas sat back down, realizing Rae was watching her son.</w:t>
       </w:r>
     </w:p>
     <w:p>
@@ -966,7 +859,7 @@
           <w:color w:val="000000"/>
           <w:sz w:val="24"/>
         </w:rPr>
-        <w:t>Rae was watching her son.</w:t>
+        <w:t>“Well,” Camille said quietly. “Would you look at that.”</w:t>
       </w:r>
     </w:p>
     <w:p>
@@ -981,7 +874,7 @@
           <w:color w:val="000000"/>
           <w:sz w:val="24"/>
         </w:rPr>
-        <w:t>She hadn't moved through any of it. Her hands were still folded on the table, her face still gave nobody anything. But she was watching Remy on the floor with the mint and the tapping fingers, and for one second, something went across her face that Silas had never seen there before. It was there and gone so fast he'd have missed it if he'd blinked.</w:t>
+        <w:t>Rae unfolded her hands and laid them flat on the table. Her bells shifted on her wrist without making a sound. “Your ward won’t hold her,” she said to Camille.</w:t>
       </w:r>
     </w:p>
     <w:p>
@@ -996,7 +889,7 @@
           <w:color w:val="000000"/>
           <w:sz w:val="24"/>
         </w:rPr>
-        <w:t>Camille saw it too. Silas watched his mother see it.</w:t>
+        <w:t>Camille pushed her glasses up. “I know my ward won’t hold her. I’m the one who sewed it.”</w:t>
       </w:r>
     </w:p>
     <w:p>
@@ -1011,7 +904,7 @@
           <w:color w:val="000000"/>
           <w:sz w:val="24"/>
         </w:rPr>
-        <w:t>"Well," Camille said quietly. "Would you look at that."</w:t>
+        <w:t>“Dante’s houses won’t hold her. Synod walls won’t hold her, and the Shrouds will find her before the week’s out if she keeps lighting up streets.” Rae looked at Melena. “She doesn’t need walls that hold. She needs walls that eat.”</w:t>
       </w:r>
     </w:p>
     <w:p>
@@ -1026,7 +919,7 @@
           <w:color w:val="000000"/>
           <w:sz w:val="24"/>
         </w:rPr>
-        <w:t>Rae's face closed again. She unfolded her hands and laid them flat on the table, and her bells shifted on her wrist without making a sound.</w:t>
+        <w:t>Camille froze. “No.”</w:t>
       </w:r>
     </w:p>
     <w:p>
@@ -1041,7 +934,7 @@
           <w:color w:val="000000"/>
           <w:sz w:val="24"/>
         </w:rPr>
-        <w:t>"Your ward won't hold her," she said to Camille.</w:t>
+        <w:t>Rae turned one hand over on the table, palm up, like she was setting something down in it. “Ora’s walls have eaten more grief than this whole tier has ever cried.”</w:t>
       </w:r>
     </w:p>
     <w:p>
@@ -1056,7 +949,7 @@
           <w:color w:val="000000"/>
           <w:sz w:val="24"/>
         </w:rPr>
-        <w:t>Camille pushed her glasses up onto her head. "I know my ward won't hold her. I'm the one who sewed it."</w:t>
+        <w:t>“No, Renae.” Camille stood up so fast the crossword slid off the table. “You are not taking that child into a Hush den.”</w:t>
       </w:r>
     </w:p>
     <w:p>
@@ -1071,7 +964,7 @@
           <w:color w:val="000000"/>
           <w:sz w:val="24"/>
         </w:rPr>
-        <w:t>"And Dante's houses won't hold her. And Synod walls won't hold her, and the Shrouds will find her before the week's out if she keeps lighting up streets." Rae looked at Melena. "She doesn't need walls that hold. She needs walls that eat."</w:t>
+        <w:t>“I’m not taking her to the den. I’m taking her to the walls.” Rae shot Camille a look. “Every line of thread in that bathhouse is grief somebody paid to get rid of. Sewn tight, three hundred lines deep. Whatever’s burning in her, it’s eating what she feels. You put her inside walls that are hungrier than she is, and it’ll go quiet.” She paused. “And if it doesn’t, Ora has other things.”</w:t>
       </w:r>
     </w:p>
     <w:p>
@@ -1086,7 +979,7 @@
           <w:color w:val="000000"/>
           <w:sz w:val="24"/>
         </w:rPr>
-        <w:t>Camille went very still. "No."</w:t>
+        <w:t>“Hush,” Camille said. The word came out like she’d spat it.</w:t>
       </w:r>
     </w:p>
     <w:p>
@@ -1101,7 +994,7 @@
           <w:color w:val="000000"/>
           <w:sz w:val="24"/>
         </w:rPr>
-        <w:t>Rae turned one hand over on the table, palm up, like she was setting something down in it. "Ora's walls have eaten more grief than this whole tier has ever cried."</w:t>
+        <w:t>“One drop. Ora measures it herself.” Rae finally turned her head and looked at Silas. “You could have handled her yourself, but you let your Mama call me. You know good as I do that she needs something more than what anyone in this room can offer her.”</w:t>
       </w:r>
     </w:p>
     <w:p>
@@ -1116,24 +1009,22 @@
           <w:color w:val="000000"/>
           <w:sz w:val="24"/>
         </w:rPr>
-        <w:t>"</w:t>
+        <w:t>Silas felt heat crawl up his neck, but he didn’t say anything. Melena was staring at the table again, eyes unfocused as if she’d already been hollowed out. But he could see the tension in her jaw—the part of her waiting for a decision to be made, then bracing for whatever came after.</w:t>
       </w:r>
-      <w:r>
-        <w:rPr>
-          <w:rFonts w:ascii="Times New Roman" w:hAnsi="Times New Roman" w:cs="Times New Roman" w:eastAsia="Times New Roman"/>
-          <w:i/>
-          <w:color w:val="000000"/>
-          <w:sz w:val="24"/>
-        </w:rPr>
-        <w:t>No</w:t>
-      </w:r>
+    </w:p>
+    <w:p>
+      <w:pPr>
+        <w:spacing w:before="0" w:after="0" w:lineRule="auto" w:line="276"/>
+        <w:ind w:left="0" w:right="0" w:firstLine="720"/>
+        <w:jc w:val="left"/>
+      </w:pPr>
       <w:r>
         <w:rPr>
           <w:rFonts w:ascii="Times New Roman" w:hAnsi="Times New Roman" w:cs="Times New Roman" w:eastAsia="Times New Roman"/>
           <w:color w:val="000000"/>
           <w:sz w:val="24"/>
         </w:rPr>
-        <w:t>, Renae." Camille stood up so fast the crossword slid off the table. "You are not taking that child into a Hush den."</w:t>
+        <w:t>“Maven,” Camille finally spoke up. “You think they not watching every Hush den in Shadowmere to see where you going next?” Even Remy flinched at that. He rolled the mint between his fingers and stared at the ground, as if the next words might come crawling up out of it.</w:t>
       </w:r>
     </w:p>
     <w:p>
@@ -1148,7 +1039,7 @@
           <w:color w:val="000000"/>
           <w:sz w:val="24"/>
         </w:rPr>
-        <w:t>"I'm not taking her to the den. I'm taking her to the walls." Rae didn't stand. She didn't need to. "Every line of thread in that bathhouse is grief somebody paid to get rid of. Sewn tight, three hundred lines deep. Whatever's burning in her, it's eating what she feels. You put her inside walls that are hungrier than she is, and it'll go quiet." She paused. "And if it doesn't, Ora has other things."</w:t>
+        <w:t>“Ora’s paid up for the year.” Rae stood up. She was a small woman. Silas had never noticed before, because she’d never stood next to his mother when Camille was this angry. “You want to know what she is? You come and watch, then. That’s as much as I’ll give you tonight. It’s more than I gave Dante.”</w:t>
       </w:r>
     </w:p>
     <w:p>
@@ -1163,82 +1054,7 @@
           <w:color w:val="000000"/>
           <w:sz w:val="24"/>
         </w:rPr>
-        <w:t>"Hush," Camille said. The word came out like she'd spat it.</w:t>
-      </w:r>
-    </w:p>
-    <w:p>
-      <w:pPr>
-        <w:spacing w:before="0" w:after="0" w:lineRule="auto" w:line="276"/>
-        <w:ind w:left="0" w:right="0" w:firstLine="720"/>
-        <w:jc w:val="left"/>
-      </w:pPr>
-      <w:r>
-        <w:rPr>
-          <w:rFonts w:ascii="Times New Roman" w:hAnsi="Times New Roman" w:cs="Times New Roman" w:eastAsia="Times New Roman"/>
-          <w:color w:val="000000"/>
-          <w:sz w:val="24"/>
-        </w:rPr>
-        <w:t>"One drop. Measured. Ora measures it herself." Rae finally turned her head and looked at Silas, and he felt it in his spine. "And your son will be standing next to her the whole time, because Dante handed her to him, and he took her."</w:t>
-      </w:r>
-    </w:p>
-    <w:p>
-      <w:pPr>
-        <w:spacing w:before="0" w:after="0" w:lineRule="auto" w:line="276"/>
-        <w:ind w:left="0" w:right="0" w:firstLine="720"/>
-        <w:jc w:val="left"/>
-      </w:pPr>
-      <w:r>
-        <w:rPr>
-          <w:rFonts w:ascii="Times New Roman" w:hAnsi="Times New Roman" w:cs="Times New Roman" w:eastAsia="Times New Roman"/>
-          <w:color w:val="000000"/>
-          <w:sz w:val="24"/>
-        </w:rPr>
-        <w:t>"Final bell," Rae said. "All of you."</w:t>
-      </w:r>
-    </w:p>
-    <w:p>
-      <w:pPr>
-        <w:spacing w:before="0" w:after="0" w:lineRule="auto" w:line="276"/>
-        <w:ind w:left="0" w:right="0" w:firstLine="720"/>
-        <w:jc w:val="left"/>
-      </w:pPr>
-      <w:r>
-        <w:rPr>
-          <w:rFonts w:ascii="Times New Roman" w:hAnsi="Times New Roman" w:cs="Times New Roman" w:eastAsia="Times New Roman"/>
-          <w:color w:val="000000"/>
-          <w:sz w:val="24"/>
-        </w:rPr>
-        <w:t>"All of us," Camille repeated.</w:t>
-      </w:r>
-    </w:p>
-    <w:p>
-      <w:pPr>
-        <w:spacing w:before="0" w:after="0" w:lineRule="auto" w:line="276"/>
-        <w:ind w:left="0" w:right="0" w:firstLine="720"/>
-        <w:jc w:val="left"/>
-      </w:pPr>
-      <w:r>
-        <w:rPr>
-          <w:rFonts w:ascii="Times New Roman" w:hAnsi="Times New Roman" w:cs="Times New Roman" w:eastAsia="Times New Roman"/>
-          <w:color w:val="000000"/>
-          <w:sz w:val="24"/>
-        </w:rPr>
-        <w:t>"You want to know what she is?" Rae stood up. She was a small woman. Silas had never noticed that before, because she'd never been standing next to his mother when Camille was this angry. "You come and watch, then. That's as much as I'll give you tonight. It's more than I gave Dante."</w:t>
-      </w:r>
-    </w:p>
-    <w:p>
-      <w:pPr>
-        <w:spacing w:before="0" w:after="0" w:lineRule="auto" w:line="276"/>
-        <w:ind w:left="0" w:right="0" w:firstLine="720"/>
-        <w:jc w:val="left"/>
-      </w:pPr>
-      <w:r>
-        <w:rPr>
-          <w:rFonts w:ascii="Times New Roman" w:hAnsi="Times New Roman" w:cs="Times New Roman" w:eastAsia="Times New Roman"/>
-          <w:color w:val="000000"/>
-          <w:sz w:val="24"/>
-        </w:rPr>
-        <w:t>She went to the door. Remy got up off the floor, picked up the mint, and put it in Melena's hand without touching her skin, closing her fingers around it from the outside of her fist, and then he followed his mother out into the rain.</w:t>
+        <w:t>She went to the door. Remy got up off the floor, picked up the mint, and put it in Melena’s hand without touching her, closing her fingers around it from the outside of her fist, before he followed his mother out into the rain.</w:t>
       </w:r>
     </w:p>
     <w:p>
@@ -1283,7 +1099,7 @@
           <w:color w:val="000000"/>
           <w:sz w:val="24"/>
         </w:rPr>
-        <w:t>"Ma," Silas said.</w:t>
+        <w:t>“Ma,” Silas said.</w:t>
       </w:r>
     </w:p>
     <w:p>
@@ -1298,7 +1114,7 @@
           <w:color w:val="000000"/>
           <w:sz w:val="24"/>
         </w:rPr>
-        <w:t>"Go sit on your step, Silas." She bent down and picked up the paper. "I'm gonna sit right here and listen to my thread. And in the morning I'm gonna call your daddy, and he's gonna wish he slept in his shoes."</w:t>
+        <w:t>“Try to sleep, Silas.” She bent down and picked up the paper. “I’m gonna sit right here and listen to my thread. And in the morning I’m gonna call your daddy, and he’s gonna wish he slept in his shoes.”</w:t>
       </w:r>
     </w:p>
     <w:p>
@@ -1328,7 +1144,7 @@
           <w:color w:val="000000"/>
           <w:sz w:val="24"/>
         </w:rPr>
-        <w:t>He didn't sleep. He sat on the step until the rain thinned to a drizzle and the cavern lights came up grey for first bell, and he thought about walls that eat, and about the look on Rae's face when she watched Remy on the floor.</w:t>
+        <w:t>Silas didn’t try to sleep.</w:t>
       </w:r>
     </w:p>
     <w:p>
@@ -1343,7 +1159,7 @@
           <w:color w:val="000000"/>
           <w:sz w:val="24"/>
         </w:rPr>
-        <w:t>He thought about an Ashvein girl's hand jammed in her skirt for a while too, which didn't help anything.</w:t>
+        <w:t>He sat on the cot in the front room with his back to the wall and his bad hand open on his knee so the burn could breathe, and he laid the last two days out in his head the way Dante laid pins on the map-room glass.</w:t>
       </w:r>
     </w:p>
     <w:p>
@@ -1358,23 +1174,7 @@
           <w:color w:val="000000"/>
           <w:sz w:val="24"/>
         </w:rPr>
-        <w:t>At first bell he took out his phone.</w:t>
-      </w:r>
-    </w:p>
-    <w:p>
-      <w:pPr>
-        <w:spacing w:before="0" w:after="0" w:lineRule="auto" w:line="276"/>
-        <w:ind w:left="0" w:right="0" w:firstLine="720"/>
-        <w:jc w:val="left"/>
-      </w:pPr>
-      <w:r>
-        <w:rPr>
-          <w:rFonts w:ascii="Times New Roman" w:hAnsi="Times New Roman" w:cs="Times New Roman" w:eastAsia="Times New Roman"/>
-          <w:i/>
-          <w:color w:val="000000"/>
-          <w:sz w:val="24"/>
-        </w:rPr>
-        <w:t>Silas: Where's breakfast?</w:t>
+        <w:t>Lorraine counting watchers on the Mercer steps she’d never had to count before. Quietcasters walking the edges of Rae’s routes. Two men by Pell’s basin who’d stopped talking to look at a hood. Two Shrouds coming down Lamp Street under Silence, and one of them stopping at a closed threshold shop to taste the air.</w:t>
       </w:r>
     </w:p>
     <w:p>
@@ -1389,7 +1189,7 @@
           <w:color w:val="000000"/>
           <w:sz w:val="24"/>
         </w:rPr>
-        <w:t>Remy came around the corner twenty minutes later with three paper sacks in his arms and his messenger bag across his chest, and he was grinning. Not his regular grin. His terrible one. The one he'd worn when they were thirteen and he'd found out Silas had a crush on the tram conductor's daughter.</w:t>
+        <w:t>Four sets of eyes in one day, on one girl who’d been in Shadowmere less than twenty-four hours. Nobody just happened across somebody in Gutterlight that fast. Somebody had been waiting on her before she ever came down the stairs from Halflight.</w:t>
       </w:r>
     </w:p>
     <w:p>
@@ -1404,7 +1204,7 @@
           <w:color w:val="000000"/>
           <w:sz w:val="24"/>
         </w:rPr>
-        <w:t>Silas stood up off the step. "What."</w:t>
+        <w:t>And Rae had walked into this kitchen and asked for one more night of trust and handed out nothing to earn it.</w:t>
       </w:r>
     </w:p>
     <w:p>
@@ -1419,67 +1219,7 @@
           <w:color w:val="000000"/>
           <w:sz w:val="24"/>
         </w:rPr>
-        <w:t>"Nothing." Remy handed him a sack. It was hot. "Eat."</w:t>
-      </w:r>
-    </w:p>
-    <w:p>
-      <w:pPr>
-        <w:spacing w:before="0" w:after="0" w:lineRule="auto" w:line="276"/>
-        <w:ind w:left="0" w:right="0" w:firstLine="720"/>
-        <w:jc w:val="left"/>
-      </w:pPr>
-      <w:r>
-        <w:rPr>
-          <w:rFonts w:ascii="Times New Roman" w:hAnsi="Times New Roman" w:cs="Times New Roman" w:eastAsia="Times New Roman"/>
-          <w:color w:val="000000"/>
-          <w:sz w:val="24"/>
-        </w:rPr>
-        <w:t>Silas didn't take his eyes off him. "Remy."</w:t>
-      </w:r>
-    </w:p>
-    <w:p>
-      <w:pPr>
-        <w:spacing w:before="0" w:after="0" w:lineRule="auto" w:line="276"/>
-        <w:ind w:left="0" w:right="0" w:firstLine="720"/>
-        <w:jc w:val="left"/>
-      </w:pPr>
-      <w:r>
-        <w:rPr>
-          <w:rFonts w:ascii="Times New Roman" w:hAnsi="Times New Roman" w:cs="Times New Roman" w:eastAsia="Times New Roman"/>
-          <w:color w:val="000000"/>
-          <w:sz w:val="24"/>
-        </w:rPr>
-        <w:t>"I just had a real interesting morning, that's all." Remy pushed past him into the house. "Mrs. Graves! I brought eggs! Don't kill me!"</w:t>
-      </w:r>
-    </w:p>
-    <w:p>
-      <w:pPr>
-        <w:spacing w:before="0" w:after="0" w:lineRule="auto" w:line="276"/>
-        <w:ind w:left="0" w:right="0" w:firstLine="720"/>
-        <w:jc w:val="left"/>
-      </w:pPr>
-      <w:r>
-        <w:rPr>
-          <w:rFonts w:ascii="Times New Roman" w:hAnsi="Times New Roman" w:cs="Times New Roman" w:eastAsia="Times New Roman"/>
-          <w:color w:val="000000"/>
-          <w:sz w:val="24"/>
-        </w:rPr>
-        <w:t>From the kitchen, Camille said, "Leave them on the counter and I'll think about it."</w:t>
-      </w:r>
-    </w:p>
-    <w:p>
-      <w:pPr>
-        <w:spacing w:before="0" w:after="0" w:lineRule="auto" w:line="276"/>
-        <w:ind w:left="0" w:right="0" w:firstLine="720"/>
-        <w:jc w:val="left"/>
-      </w:pPr>
-      <w:r>
-        <w:rPr>
-          <w:rFonts w:ascii="Times New Roman" w:hAnsi="Times New Roman" w:cs="Times New Roman" w:eastAsia="Times New Roman"/>
-          <w:color w:val="000000"/>
-          <w:sz w:val="24"/>
-        </w:rPr>
-        <w:t xml:space="preserve">They ate standing up, the three of them, while Melena slept in the back room with the door open and the lamp on. Camille had told her to leave it open. Melena had looked at the door, then at Camille, and said </w:t>
+        <w:t xml:space="preserve">Down the hall, Melena slept with the back-room door open and the lamp on. Camille had told her to leave it open. Melena had looked at the door, then at Camille, and said </w:t>
       </w:r>
       <w:r>
         <w:rPr>
@@ -1496,7 +1236,7 @@
           <w:color w:val="000000"/>
           <w:sz w:val="24"/>
         </w:rPr>
-        <w:t xml:space="preserve"> in a voice like it had cost her something.</w:t>
+        <w:t xml:space="preserve"> like it cost her something. In the kitchen, Camille sat with her crossword and didn’t fill in a single square. Every so often the thread on the frame hummed, and every time it did, her pencil stopped.</w:t>
       </w:r>
     </w:p>
     <w:p>
@@ -1511,7 +1251,7 @@
           <w:color w:val="000000"/>
           <w:sz w:val="24"/>
         </w:rPr>
-        <w:t>Remy was still grinning.</w:t>
+        <w:t>An hour before first bell, Silas got up and put his coat on.</w:t>
       </w:r>
     </w:p>
     <w:p>
@@ -1526,7 +1266,7 @@
           <w:color w:val="000000"/>
           <w:sz w:val="24"/>
         </w:rPr>
-        <w:t>Silas put his dough down. "If you don't say it, I'm gonna put you through that wall."</w:t>
+        <w:t>Camille didn’t look up. “Where you going?”</w:t>
       </w:r>
     </w:p>
     <w:p>
@@ -1541,7 +1281,7 @@
           <w:color w:val="000000"/>
           <w:sz w:val="24"/>
         </w:rPr>
-        <w:t>"Okay." Remy wiped his hands on his coat. "So. Yesterday. At Pell's. You knocked somebody's salt into a puddle."</w:t>
+        <w:t>“Pell’s.” He shrugged his coat straight over the bad shoulder.</w:t>
       </w:r>
     </w:p>
     <w:p>
@@ -1556,7 +1296,7 @@
           <w:color w:val="000000"/>
           <w:sz w:val="24"/>
         </w:rPr>
-        <w:t>Silas went still with a piece of dough halfway to his mouth.</w:t>
+        <w:t>She filled in a square, finally, and didn’t look up from it. “Pell don’t open till second bell.”</w:t>
       </w:r>
     </w:p>
     <w:p>
@@ -1571,360 +1311,7 @@
           <w:color w:val="000000"/>
           <w:sz w:val="24"/>
         </w:rPr>
-        <w:t>"Eighteen Veils of funeral grade," Remy went on, delighted. "And then you paid Pell four for another bag and told her the debt was yours. And she told you she ain't want no debt tied to nobody in Shadowmere."</w:t>
-      </w:r>
-    </w:p>
-    <w:p>
-      <w:pPr>
-        <w:spacing w:before="0" w:after="0" w:lineRule="auto" w:line="276"/>
-        <w:ind w:left="0" w:right="0" w:firstLine="720"/>
-        <w:jc w:val="left"/>
-      </w:pPr>
-      <w:r>
-        <w:rPr>
-          <w:rFonts w:ascii="Times New Roman" w:hAnsi="Times New Roman" w:cs="Times New Roman" w:eastAsia="Times New Roman"/>
-          <w:color w:val="000000"/>
-          <w:sz w:val="24"/>
-        </w:rPr>
-        <w:t>Silas set the dough down on the paper. "How do you—"</w:t>
-      </w:r>
-    </w:p>
-    <w:p>
-      <w:pPr>
-        <w:spacing w:before="0" w:after="0" w:lineRule="auto" w:line="276"/>
-        <w:ind w:left="0" w:right="0" w:firstLine="720"/>
-        <w:jc w:val="left"/>
-      </w:pPr>
-      <w:r>
-        <w:rPr>
-          <w:rFonts w:ascii="Times New Roman" w:hAnsi="Times New Roman" w:cs="Times New Roman" w:eastAsia="Times New Roman"/>
-          <w:color w:val="000000"/>
-          <w:sz w:val="24"/>
-        </w:rPr>
-        <w:t xml:space="preserve">"And then </w:t>
-      </w:r>
-      <w:r>
-        <w:rPr>
-          <w:rFonts w:ascii="Times New Roman" w:hAnsi="Times New Roman" w:cs="Times New Roman" w:eastAsia="Times New Roman"/>
-          <w:i/>
-          <w:color w:val="000000"/>
-          <w:sz w:val="24"/>
-        </w:rPr>
-        <w:t>you</w:t>
-      </w:r>
-      <w:r>
-        <w:rPr>
-          <w:rFonts w:ascii="Times New Roman" w:hAnsi="Times New Roman" w:cs="Times New Roman" w:eastAsia="Times New Roman"/>
-          <w:color w:val="000000"/>
-          <w:sz w:val="24"/>
-        </w:rPr>
-        <w:t xml:space="preserve"> told </w:t>
-      </w:r>
-      <w:r>
-        <w:rPr>
-          <w:rFonts w:ascii="Times New Roman" w:hAnsi="Times New Roman" w:cs="Times New Roman" w:eastAsia="Times New Roman"/>
-          <w:i/>
-          <w:color w:val="000000"/>
-          <w:sz w:val="24"/>
-        </w:rPr>
-        <w:t>her</w:t>
-      </w:r>
-      <w:r>
-        <w:rPr>
-          <w:rFonts w:ascii="Times New Roman" w:hAnsi="Times New Roman" w:cs="Times New Roman" w:eastAsia="Times New Roman"/>
-          <w:color w:val="000000"/>
-          <w:sz w:val="24"/>
-        </w:rPr>
-        <w:t xml:space="preserve"> to stand somewhere else." Remy pointed an egg at him like a judge with a gavel.</w:t>
-      </w:r>
-    </w:p>
-    <w:p>
-      <w:pPr>
-        <w:spacing w:before="0" w:after="0" w:lineRule="auto" w:line="276"/>
-        <w:ind w:left="0" w:right="0" w:firstLine="720"/>
-        <w:jc w:val="left"/>
-      </w:pPr>
-      <w:r>
-        <w:rPr>
-          <w:rFonts w:ascii="Times New Roman" w:hAnsi="Times New Roman" w:cs="Times New Roman" w:eastAsia="Times New Roman"/>
-          <w:color w:val="000000"/>
-          <w:sz w:val="24"/>
-        </w:rPr>
-        <w:t>At the counter, Camille put her tea down very slowly.</w:t>
-      </w:r>
-    </w:p>
-    <w:p>
-      <w:pPr>
-        <w:spacing w:before="0" w:after="0" w:lineRule="auto" w:line="276"/>
-        <w:ind w:left="0" w:right="0" w:firstLine="720"/>
-        <w:jc w:val="left"/>
-      </w:pPr>
-      <w:r>
-        <w:rPr>
-          <w:rFonts w:ascii="Times New Roman" w:hAnsi="Times New Roman" w:cs="Times New Roman" w:eastAsia="Times New Roman"/>
-          <w:color w:val="000000"/>
-          <w:sz w:val="24"/>
-        </w:rPr>
-        <w:t>Silas looked at Remy. "Who told you that?"</w:t>
-      </w:r>
-    </w:p>
-    <w:p>
-      <w:pPr>
-        <w:spacing w:before="0" w:after="0" w:lineRule="auto" w:line="276"/>
-        <w:ind w:left="0" w:right="0" w:firstLine="720"/>
-        <w:jc w:val="left"/>
-      </w:pPr>
-      <w:r>
-        <w:rPr>
-          <w:rFonts w:ascii="Times New Roman" w:hAnsi="Times New Roman" w:cs="Times New Roman" w:eastAsia="Times New Roman"/>
-          <w:color w:val="000000"/>
-          <w:sz w:val="24"/>
-        </w:rPr>
-        <w:t>"She did," Remy said around a mouthful.</w:t>
-      </w:r>
-    </w:p>
-    <w:p>
-      <w:pPr>
-        <w:spacing w:before="0" w:after="0" w:lineRule="auto" w:line="276"/>
-        <w:ind w:left="0" w:right="0" w:firstLine="720"/>
-        <w:jc w:val="left"/>
-      </w:pPr>
-      <w:r>
-        <w:rPr>
-          <w:rFonts w:ascii="Times New Roman" w:hAnsi="Times New Roman" w:cs="Times New Roman" w:eastAsia="Times New Roman"/>
-          <w:color w:val="000000"/>
-          <w:sz w:val="24"/>
-        </w:rPr>
-        <w:t>Silas put both hands on the counter. "</w:t>
-      </w:r>
-      <w:r>
-        <w:rPr>
-          <w:rFonts w:ascii="Times New Roman" w:hAnsi="Times New Roman" w:cs="Times New Roman" w:eastAsia="Times New Roman"/>
-          <w:i/>
-          <w:color w:val="000000"/>
-          <w:sz w:val="24"/>
-        </w:rPr>
-        <w:t>She</w:t>
-      </w:r>
-      <w:r>
-        <w:rPr>
-          <w:rFonts w:ascii="Times New Roman" w:hAnsi="Times New Roman" w:cs="Times New Roman" w:eastAsia="Times New Roman"/>
-          <w:color w:val="000000"/>
-          <w:sz w:val="24"/>
-        </w:rPr>
-        <w:t xml:space="preserve"> did?"</w:t>
-      </w:r>
-    </w:p>
-    <w:p>
-      <w:pPr>
-        <w:spacing w:before="0" w:after="0" w:lineRule="auto" w:line="276"/>
-        <w:ind w:left="0" w:right="0" w:firstLine="720"/>
-        <w:jc w:val="left"/>
-      </w:pPr>
-      <w:r>
-        <w:rPr>
-          <w:rFonts w:ascii="Times New Roman" w:hAnsi="Times New Roman" w:cs="Times New Roman" w:eastAsia="Times New Roman"/>
-          <w:color w:val="000000"/>
-          <w:sz w:val="24"/>
-        </w:rPr>
-        <w:t xml:space="preserve">"She's my godsister, Si." Remy was having the best morning of his life. "She came up Ma's stairs at four this morning. Sat in our kitchen. Ate my eggs. And she remembered </w:t>
-      </w:r>
-      <w:r>
-        <w:rPr>
-          <w:rFonts w:ascii="Times New Roman" w:hAnsi="Times New Roman" w:cs="Times New Roman" w:eastAsia="Times New Roman"/>
-          <w:i/>
-          <w:color w:val="000000"/>
-          <w:sz w:val="24"/>
-        </w:rPr>
-        <w:t>a whole lot</w:t>
-      </w:r>
-      <w:r>
-        <w:rPr>
-          <w:rFonts w:ascii="Times New Roman" w:hAnsi="Times New Roman" w:cs="Times New Roman" w:eastAsia="Times New Roman"/>
-          <w:color w:val="000000"/>
-          <w:sz w:val="24"/>
-        </w:rPr>
-        <w:t xml:space="preserve"> about you, man."</w:t>
-      </w:r>
-    </w:p>
-    <w:p>
-      <w:pPr>
-        <w:spacing w:before="0" w:after="0" w:lineRule="auto" w:line="276"/>
-        <w:ind w:left="0" w:right="0" w:firstLine="720"/>
-        <w:jc w:val="left"/>
-      </w:pPr>
-      <w:r>
-        <w:rPr>
-          <w:rFonts w:ascii="Times New Roman" w:hAnsi="Times New Roman" w:cs="Times New Roman" w:eastAsia="Times New Roman"/>
-          <w:color w:val="000000"/>
-          <w:sz w:val="24"/>
-        </w:rPr>
-        <w:t>Silas didn't say anything. He couldn't think of a single thing to say, which almost never happened, and Remy watched it not happen with enormous satisfaction.</w:t>
-      </w:r>
-    </w:p>
-    <w:p>
-      <w:pPr>
-        <w:spacing w:before="0" w:after="0" w:lineRule="auto" w:line="276"/>
-        <w:ind w:left="0" w:right="0" w:firstLine="720"/>
-        <w:jc w:val="left"/>
-      </w:pPr>
-      <w:r>
-        <w:rPr>
-          <w:rFonts w:ascii="Times New Roman" w:hAnsi="Times New Roman" w:cs="Times New Roman" w:eastAsia="Times New Roman"/>
-          <w:color w:val="000000"/>
-          <w:sz w:val="24"/>
-        </w:rPr>
-        <w:t>Rae's goddaughter. The girl from the lane, with the silver locs and the rings and the hand in her skirt, was Rae's goddaughter. Remy's godsister. She'd been sitting in Rae's kitchen this morning, telling Remy about him.</w:t>
-      </w:r>
-    </w:p>
-    <w:p>
-      <w:pPr>
-        <w:spacing w:before="0" w:after="0" w:lineRule="auto" w:line="276"/>
-        <w:ind w:left="0" w:right="0" w:firstLine="720"/>
-        <w:jc w:val="left"/>
-      </w:pPr>
-      <w:r>
-        <w:rPr>
-          <w:rFonts w:ascii="Times New Roman" w:hAnsi="Times New Roman" w:cs="Times New Roman" w:eastAsia="Times New Roman"/>
-          <w:color w:val="000000"/>
-          <w:sz w:val="24"/>
-        </w:rPr>
-        <w:t>She'd remembered a whole lot.</w:t>
-      </w:r>
-    </w:p>
-    <w:p>
-      <w:pPr>
-        <w:spacing w:before="0" w:after="0" w:lineRule="auto" w:line="276"/>
-        <w:ind w:left="0" w:right="0" w:firstLine="720"/>
-        <w:jc w:val="left"/>
-      </w:pPr>
-      <w:r>
-        <w:rPr>
-          <w:rFonts w:ascii="Times New Roman" w:hAnsi="Times New Roman" w:cs="Times New Roman" w:eastAsia="Times New Roman"/>
-          <w:color w:val="000000"/>
-          <w:sz w:val="24"/>
-        </w:rPr>
-        <w:t>"What'd she say?" Silas heard himself ask, and immediately wanted to put himself through the wall.</w:t>
-      </w:r>
-    </w:p>
-    <w:p>
-      <w:pPr>
-        <w:spacing w:before="0" w:after="0" w:lineRule="auto" w:line="276"/>
-        <w:ind w:left="0" w:right="0" w:firstLine="720"/>
-        <w:jc w:val="left"/>
-      </w:pPr>
-      <w:r>
-        <w:rPr>
-          <w:rFonts w:ascii="Times New Roman" w:hAnsi="Times New Roman" w:cs="Times New Roman" w:eastAsia="Times New Roman"/>
-          <w:color w:val="000000"/>
-          <w:sz w:val="24"/>
-        </w:rPr>
-        <w:t>Camille made a small sound into her tea.</w:t>
-      </w:r>
-    </w:p>
-    <w:p>
-      <w:pPr>
-        <w:spacing w:before="0" w:after="0" w:lineRule="auto" w:line="276"/>
-        <w:ind w:left="0" w:right="0" w:firstLine="720"/>
-        <w:jc w:val="left"/>
-      </w:pPr>
-      <w:r>
-        <w:rPr>
-          <w:rFonts w:ascii="Times New Roman" w:hAnsi="Times New Roman" w:cs="Times New Roman" w:eastAsia="Times New Roman"/>
-          <w:color w:val="000000"/>
-          <w:sz w:val="24"/>
-        </w:rPr>
-        <w:t>"Oh, I ain't telling you that." Remy picked up an egg and started peeling it. "That's between me and her."</w:t>
-      </w:r>
-    </w:p>
-    <w:p>
-      <w:pPr>
-        <w:spacing w:before="0" w:after="0" w:lineRule="auto" w:line="276"/>
-        <w:ind w:left="0" w:right="0" w:firstLine="720"/>
-        <w:jc w:val="left"/>
-      </w:pPr>
-      <w:r>
-        <w:rPr>
-          <w:rFonts w:ascii="Times New Roman" w:hAnsi="Times New Roman" w:cs="Times New Roman" w:eastAsia="Times New Roman"/>
-          <w:color w:val="000000"/>
-          <w:sz w:val="24"/>
-        </w:rPr>
-        <w:t>Silas ignored his mother. "What's her name?"</w:t>
-      </w:r>
-    </w:p>
-    <w:p>
-      <w:pPr>
-        <w:spacing w:before="0" w:after="0" w:lineRule="auto" w:line="276"/>
-        <w:ind w:left="0" w:right="0" w:firstLine="720"/>
-        <w:jc w:val="left"/>
-      </w:pPr>
-      <w:r>
-        <w:rPr>
-          <w:rFonts w:ascii="Times New Roman" w:hAnsi="Times New Roman" w:cs="Times New Roman" w:eastAsia="Times New Roman"/>
-          <w:color w:val="000000"/>
-          <w:sz w:val="24"/>
-        </w:rPr>
-        <w:t>Remy stopped peeling. He looked at Silas for a long moment, and the grin went somewhere and came back smaller and realer.</w:t>
-      </w:r>
-    </w:p>
-    <w:p>
-      <w:pPr>
-        <w:spacing w:before="0" w:after="0" w:lineRule="auto" w:line="276"/>
-        <w:ind w:left="0" w:right="0" w:firstLine="720"/>
-        <w:jc w:val="left"/>
-      </w:pPr>
-      <w:r>
-        <w:rPr>
-          <w:rFonts w:ascii="Times New Roman" w:hAnsi="Times New Roman" w:cs="Times New Roman" w:eastAsia="Times New Roman"/>
-          <w:color w:val="000000"/>
-          <w:sz w:val="24"/>
-        </w:rPr>
-        <w:t>"Nah," he said. "If she wanted you to have it, she'd have given it to you in the lane."</w:t>
-      </w:r>
-    </w:p>
-    <w:p>
-      <w:pPr>
-        <w:spacing w:before="0" w:after="0" w:lineRule="auto" w:line="276"/>
-        <w:ind w:left="0" w:right="0" w:firstLine="720"/>
-        <w:jc w:val="left"/>
-      </w:pPr>
-      <w:r>
-        <w:rPr>
-          <w:rFonts w:ascii="Times New Roman" w:hAnsi="Times New Roman" w:cs="Times New Roman" w:eastAsia="Times New Roman"/>
-          <w:color w:val="000000"/>
-          <w:sz w:val="24"/>
-        </w:rPr>
-        <w:t>Silas thought about that. She'd stood there in the rain with her chin up and cussed him out and taken the salt and walked off without looking back. She hadn't given him anything.</w:t>
-      </w:r>
-    </w:p>
-    <w:p>
-      <w:pPr>
-        <w:spacing w:before="0" w:after="0" w:lineRule="auto" w:line="276"/>
-        <w:ind w:left="0" w:right="0" w:firstLine="720"/>
-        <w:jc w:val="left"/>
-      </w:pPr>
-      <w:r>
-        <w:rPr>
-          <w:rFonts w:ascii="Times New Roman" w:hAnsi="Times New Roman" w:cs="Times New Roman" w:eastAsia="Times New Roman"/>
-          <w:color w:val="000000"/>
-          <w:sz w:val="24"/>
-        </w:rPr>
-        <w:t>"What was she doing at your mama's at four in the morning?" he said instead.</w:t>
-      </w:r>
-    </w:p>
-    <w:p>
-      <w:pPr>
-        <w:spacing w:before="0" w:after="0" w:lineRule="auto" w:line="276"/>
-        <w:ind w:left="0" w:right="0" w:firstLine="720"/>
-        <w:jc w:val="left"/>
-      </w:pPr>
-      <w:r>
-        <w:rPr>
-          <w:rFonts w:ascii="Times New Roman" w:hAnsi="Times New Roman" w:cs="Times New Roman" w:eastAsia="Times New Roman"/>
-          <w:color w:val="000000"/>
-          <w:sz w:val="24"/>
-        </w:rPr>
-        <w:t>Remy went back to peeling his egg, and he didn't answer that either. He just shrugged and ate the egg in two bites, and Silas, who'd known him since they were six, watched him not answer and filed it next to everything else Remy hadn't answered lately.</w:t>
+        <w:t>“He’ll open.” Silas checked the knife at his hip with his good hand. “Lock it behind me.”</w:t>
       </w:r>
     </w:p>
     <w:p>
@@ -1954,7 +1341,7 @@
           <w:color w:val="000000"/>
           <w:sz w:val="24"/>
         </w:rPr>
-        <w:t>Camille called Dante at second bell.</w:t>
+        <w:t>Shadowmere didn’t sleep so much as it changed shifts.</w:t>
       </w:r>
     </w:p>
     <w:p>
@@ -1969,7 +1356,7 @@
           <w:color w:val="000000"/>
           <w:sz w:val="24"/>
         </w:rPr>
-        <w:t>Silas heard her half of it from the step. He didn't need to hear the other half. His mother said four sentences in a voice that could've frosted a window, and then she listened for a while, and then she said, "Final bell, Dante. You can come or you can not come. But if you don't come, I'm not coming home."</w:t>
+        <w:t>The rain had thinned to a drizzle that hung in the violet mist instead of falling through it. The Ring was dark. The last of the fight crowd was coming out of the tram tunnels in twos and threes, coats open, arguing about money. Down on the corner of Lamp Street, the dice game that ran under the tailor’s awning every night was folding up, and the man who’d been holding the bank all night saw Silas coming and lifted two fingers off his cup without saying anything. Silas lifted two back.</w:t>
       </w:r>
     </w:p>
     <w:p>
@@ -1984,7 +1371,7 @@
           <w:color w:val="000000"/>
           <w:sz w:val="24"/>
         </w:rPr>
-        <w:t>She hung up. She didn't tell Silas what Dante said. She went into the back room and sat in the chair beside the bed where Melena was sleeping and did her crossword for the rest of the afternoon, and every now and then, Silas heard her put the pencil down and just sit there.</w:t>
+        <w:t>The coffee cart at the tram stop was already steaming. Old Booker ran it, the same as he had since Silas was small enough to ride on Dante’s shoulders to the Mercer building, and he had a cup poured and capped before Silas reached the cart.</w:t>
       </w:r>
     </w:p>
     <w:p>
@@ -1999,7 +1386,7 @@
           <w:color w:val="000000"/>
           <w:sz w:val="24"/>
         </w:rPr>
-        <w:t>Dante didn't come.</w:t>
+        <w:t>“Graves.” Booker set it on the counter. He looked at the burned hand, then at Silas’s face, then back down at the cup like neither of those were his business. “Long night.”</w:t>
       </w:r>
     </w:p>
     <w:p>
@@ -2014,7 +1401,7 @@
           <w:color w:val="000000"/>
           <w:sz w:val="24"/>
         </w:rPr>
-        <w:t>At final bell, Camille came out of the back room in her real shoes.</w:t>
+        <w:t>“Long week.” Silas put a Veil on the counter.</w:t>
       </w:r>
     </w:p>
     <w:p>
@@ -2029,7 +1416,7 @@
           <w:color w:val="000000"/>
           <w:sz w:val="24"/>
         </w:rPr>
-        <w:t>Silas hadn't seen his mother in real shoes in two days. Black, low heel, the ones she wore to funerals when she had to stand at the front. She had her gold clasp in her locs and her glasses on top of her head and a spool of funeral thread in her coat pocket, and she looked at Silas on the step like she was daring him to say one word about it.</w:t>
+        <w:t>Booker slid it back across. “That Jerrick business. The boy that lived, that’s my sister’s grandson.”</w:t>
       </w:r>
     </w:p>
     <w:p>
@@ -2044,7 +1431,7 @@
           <w:color w:val="000000"/>
           <w:sz w:val="24"/>
         </w:rPr>
-        <w:t>He didn't say one word about it.</w:t>
+        <w:t>Silas hadn’t known that. He picked the coin up, put it in Booker’s tip jar instead, and took the coffee. Booker let him.</w:t>
       </w:r>
     </w:p>
     <w:p>
@@ -2059,7 +1446,7 @@
           <w:color w:val="000000"/>
           <w:sz w:val="24"/>
         </w:rPr>
-        <w:t>Melena came out behind her in clothes Remy had brought in one of the sacks, work pants and a grey sweater and a brown coat that came to her knees, with a dark wrap over her hair. She looked like any girl from any tier who'd had a long week, except for the way she held her hands, closed loose at her sides, like she was carrying something hot and trying not to drop it.</w:t>
+        <w:t>The runner he wanted was asleep in the doorway of the closed pawn counter where he slept most nights, curled up in a brown route coat two sizes too big with a burn mark across the front where somebody had tried to cut the block seal off. Silas had seen him at the Ring the night of Jerrick, collecting side bets in a bucket with his hands still shaking. Fourteen, maybe. Fifteen at the most. The same age as the kid nobody had found yet.</w:t>
       </w:r>
     </w:p>
     <w:p>
@@ -2074,7 +1461,7 @@
           <w:color w:val="000000"/>
           <w:sz w:val="24"/>
         </w:rPr>
-        <w:t>The mint was still in one of them. Silas saw the silver wrapper between her fingers.</w:t>
+        <w:t>Silas crouched down and set the coffee next to his head. The boy woke up the way kids down here learned to wake up, all at once, already half on his feet with his back against the door.</w:t>
       </w:r>
     </w:p>
     <w:p>
@@ -2089,7 +1476,7 @@
           <w:color w:val="000000"/>
           <w:sz w:val="24"/>
         </w:rPr>
-        <w:t>Rae met them at the corner by the noodle counter, three streets east of Gutterlight, with Remy beside her. She didn't say anything when she saw Camille's shoes. She turned and walked, and they followed her, down an alley behind the noodle counter, through a gap in a fence, and down a short flight of stairs to a plain wooden door in a plain brick wall.</w:t>
+        <w:t>“Easy.” Silas didn’t move. “What’s your name?”</w:t>
       </w:r>
     </w:p>
     <w:p>
@@ -2104,7 +1491,7 @@
           <w:color w:val="000000"/>
           <w:sz w:val="24"/>
         </w:rPr>
-        <w:t>No lantern. No route marks cut into the frame. Nothing.</w:t>
+        <w:t>The kid looked at the coffee, then at Silas’s face. He knew it. Everybody who’d been at Gutterlight two nights ago knew it. “Teo.”</w:t>
       </w:r>
     </w:p>
     <w:p>
@@ -2119,7 +1506,7 @@
           <w:color w:val="000000"/>
           <w:sz w:val="24"/>
         </w:rPr>
-        <w:t>Silas stopped on the bottom step.</w:t>
+        <w:t>Silas nodded at the burned seal on his coat. “You run, Teo?”</w:t>
       </w:r>
     </w:p>
     <w:p>
@@ -2134,7 +1521,7 @@
           <w:color w:val="000000"/>
           <w:sz w:val="24"/>
         </w:rPr>
-        <w:t>He knew every Mercer passage in Shadowmere. He'd grown up with his elbows on Dante's map-room glass, watching the threads move, learning which doors opened to which tokens and which ones you never touched. He knew the safehouses and the drop points and the service routes behind the tailor rows. He knew every door his family owned, and most of the doors his family wanted to own.</w:t>
+        <w:t>Teo’s eyes went to the coffee again. “For who’s paying.”</w:t>
       </w:r>
     </w:p>
     <w:p>
@@ -2149,7 +1536,7 @@
           <w:color w:val="000000"/>
           <w:sz w:val="24"/>
         </w:rPr>
-        <w:t>This one wasn't on Dante's map.</w:t>
+        <w:t>“I’m paying.” Silas took out three Veils and laid them on the step one at a time so the quicksilver caught what light there was. “Lamp Street, the threshold shops, the back lanes off the dye vats. Anybody asks about a girl with red hair, you remember their face. Anybody in a long dark coat who don’t buy nothing and don’t talk to nobody, you remember their face. Anybody in grey, you don’t look at, you just remember which way they went.”</w:t>
       </w:r>
     </w:p>
     <w:p>
@@ -2164,7 +1551,7 @@
           <w:color w:val="000000"/>
           <w:sz w:val="24"/>
         </w:rPr>
-        <w:t>It wasn't anywhere.</w:t>
+        <w:t>Teo was staring at the coins. “And then what?”</w:t>
       </w:r>
     </w:p>
     <w:p>
@@ -2179,7 +1566,7 @@
           <w:color w:val="000000"/>
           <w:sz w:val="24"/>
         </w:rPr>
-        <w:t>Rae put her palm flat against the wood. Her bells rang once, and the door opened onto a stairwell full of blue light and the low, steady sound of a whole room full of people crying in the next room over, except nobody was crying. It was the walls.</w:t>
+        <w:t>“And then you come find me at the dark house past the pawn counter. You don’t knock. You sit on the step.” Silas stood. “Three now. Three more when you bring me something real.”</w:t>
       </w:r>
     </w:p>
     <w:p>
@@ -2194,7 +1581,7 @@
           <w:color w:val="000000"/>
           <w:sz w:val="24"/>
         </w:rPr>
-        <w:t>She looked back over her shoulder at Silas, still standing on the bottom step with his burned hand in his coat.</w:t>
+        <w:t>Teo’s hand went over the coins before Silas finished the sentence. He looked up at Silas with his chin out, the way kids did when they were trying to decide whether something was a trap.</w:t>
       </w:r>
     </w:p>
     <w:p>
@@ -2209,7 +1596,1019 @@
           <w:color w:val="000000"/>
           <w:sz w:val="24"/>
         </w:rPr>
-        <w:t>"Your daddy don't know everything, baby," Rae said. "Come on in."</w:t>
+        <w:t>“You the one who did Jerrick,” he said.</w:t>
+      </w:r>
+    </w:p>
+    <w:p>
+      <w:pPr>
+        <w:spacing w:before="0" w:after="0" w:lineRule="auto" w:line="276"/>
+        <w:ind w:left="0" w:right="0" w:firstLine="720"/>
+        <w:jc w:val="left"/>
+      </w:pPr>
+      <w:r>
+        <w:rPr>
+          <w:rFonts w:ascii="Times New Roman" w:hAnsi="Times New Roman" w:cs="Times New Roman" w:eastAsia="Times New Roman"/>
+          <w:color w:val="000000"/>
+          <w:sz w:val="24"/>
+        </w:rPr>
+        <w:t>Silas held his eyes. “I am.”</w:t>
+      </w:r>
+    </w:p>
+    <w:p>
+      <w:pPr>
+        <w:spacing w:before="0" w:after="0" w:lineRule="auto" w:line="276"/>
+        <w:ind w:left="0" w:right="0" w:firstLine="720"/>
+        <w:jc w:val="left"/>
+      </w:pPr>
+      <w:r>
+        <w:rPr>
+          <w:rFonts w:ascii="Times New Roman" w:hAnsi="Times New Roman" w:cs="Times New Roman" w:eastAsia="Times New Roman"/>
+          <w:color w:val="000000"/>
+          <w:sz w:val="24"/>
+        </w:rPr>
+        <w:t>The kid nodded once, slow, and put the coins inside his coat. “He had it coming.”</w:t>
+      </w:r>
+    </w:p>
+    <w:p>
+      <w:pPr>
+        <w:spacing w:before="0" w:after="0" w:lineRule="auto" w:line="276"/>
+        <w:ind w:left="0" w:right="0" w:firstLine="720"/>
+        <w:jc w:val="left"/>
+      </w:pPr>
+      <w:r>
+        <w:rPr>
+          <w:rFonts w:ascii="Times New Roman" w:hAnsi="Times New Roman" w:cs="Times New Roman" w:eastAsia="Times New Roman"/>
+          <w:color w:val="000000"/>
+          <w:sz w:val="24"/>
+        </w:rPr>
+        <w:t>Silas didn’t say anything to that. He left the coffee where it was and walked toward the market.</w:t>
+      </w:r>
+    </w:p>
+    <w:p>
+      <w:pPr>
+        <w:spacing w:before="0" w:after="0" w:lineRule="auto" w:line="276"/>
+        <w:ind w:left="0" w:right="0" w:firstLine="0"/>
+        <w:jc w:val="left"/>
+      </w:pPr>
+      <w:r>
+        <w:rPr>
+          <w:rFonts w:ascii="Times New Roman" w:hAnsi="Times New Roman" w:cs="Times New Roman" w:eastAsia="Times New Roman"/>
+          <w:color w:val="000000"/>
+          <w:sz w:val="24"/>
+        </w:rPr>
+        <w:t>#</w:t>
+      </w:r>
+    </w:p>
+    <w:p>
+      <w:pPr>
+        <w:spacing w:before="0" w:after="0" w:lineRule="auto" w:line="276"/>
+        <w:ind w:left="0" w:right="0" w:firstLine="720"/>
+        <w:jc w:val="left"/>
+      </w:pPr>
+      <w:r>
+        <w:rPr>
+          <w:rFonts w:ascii="Times New Roman" w:hAnsi="Times New Roman" w:cs="Times New Roman" w:eastAsia="Times New Roman"/>
+          <w:color w:val="000000"/>
+          <w:sz w:val="24"/>
+        </w:rPr>
+        <w:t>Pell was already behind his counter when Silas came down the lane behind the freight sheds. He wasn’t open. The heat lamp was off and the barrels were still covered, and he was sitting on his stool with his rings off, lined up on the counter in front of him, rubbing his knuckles. When he saw Silas, he closed his eyes like a man who’d known this was coming since yesterday afternoon.</w:t>
+      </w:r>
+    </w:p>
+    <w:p>
+      <w:pPr>
+        <w:spacing w:before="0" w:after="0" w:lineRule="auto" w:line="276"/>
+        <w:ind w:left="0" w:right="0" w:firstLine="720"/>
+        <w:jc w:val="left"/>
+      </w:pPr>
+      <w:r>
+        <w:rPr>
+          <w:rFonts w:ascii="Times New Roman" w:hAnsi="Times New Roman" w:cs="Times New Roman" w:eastAsia="Times New Roman"/>
+          <w:color w:val="000000"/>
+          <w:sz w:val="24"/>
+        </w:rPr>
+        <w:t>“We ain’t open, Graves,” he said, without opening his eyes.</w:t>
+      </w:r>
+    </w:p>
+    <w:p>
+      <w:pPr>
+        <w:spacing w:before="0" w:after="0" w:lineRule="auto" w:line="276"/>
+        <w:ind w:left="0" w:right="0" w:firstLine="720"/>
+        <w:jc w:val="left"/>
+      </w:pPr>
+      <w:r>
+        <w:rPr>
+          <w:rFonts w:ascii="Times New Roman" w:hAnsi="Times New Roman" w:cs="Times New Roman" w:eastAsia="Times New Roman"/>
+          <w:color w:val="000000"/>
+          <w:sz w:val="24"/>
+        </w:rPr>
+        <w:t>“I know.” Silas leaned his good forearm on the counter. “Two men by the basin yesterday. Right before I knocked that girl’s salt out her hand. One of them was looking at the hood behind me.”</w:t>
+      </w:r>
+    </w:p>
+    <w:p>
+      <w:pPr>
+        <w:spacing w:before="0" w:after="0" w:lineRule="auto" w:line="276"/>
+        <w:ind w:left="0" w:right="0" w:firstLine="720"/>
+        <w:jc w:val="left"/>
+      </w:pPr>
+      <w:r>
+        <w:rPr>
+          <w:rFonts w:ascii="Times New Roman" w:hAnsi="Times New Roman" w:cs="Times New Roman" w:eastAsia="Times New Roman"/>
+          <w:color w:val="000000"/>
+          <w:sz w:val="24"/>
+        </w:rPr>
+        <w:t>Pell opened his eyes and went back to rubbing his knuckles. “Lotta people looking at a lotta things in my lane.”</w:t>
+      </w:r>
+    </w:p>
+    <w:p>
+      <w:pPr>
+        <w:spacing w:before="0" w:after="0" w:lineRule="auto" w:line="276"/>
+        <w:ind w:left="0" w:right="0" w:firstLine="720"/>
+        <w:jc w:val="left"/>
+      </w:pPr>
+      <w:r>
+        <w:rPr>
+          <w:rFonts w:ascii="Times New Roman" w:hAnsi="Times New Roman" w:cs="Times New Roman" w:eastAsia="Times New Roman"/>
+          <w:color w:val="000000"/>
+          <w:sz w:val="24"/>
+        </w:rPr>
+        <w:t>“These two stopped talking to do it.” Silas didn’t move his arm off the counter.</w:t>
+      </w:r>
+    </w:p>
+    <w:p>
+      <w:pPr>
+        <w:spacing w:before="0" w:after="0" w:lineRule="auto" w:line="276"/>
+        <w:ind w:left="0" w:right="0" w:firstLine="720"/>
+        <w:jc w:val="left"/>
+      </w:pPr>
+      <w:r>
+        <w:rPr>
+          <w:rFonts w:ascii="Times New Roman" w:hAnsi="Times New Roman" w:cs="Times New Roman" w:eastAsia="Times New Roman"/>
+          <w:color w:val="000000"/>
+          <w:sz w:val="24"/>
+        </w:rPr>
+        <w:t>Pell picked up one of his rings and put it back down. He looked up the lane toward the bend, toward the empty place where the basin caught water off the awning, and he looked back at Silas. His hands had started to shake. Silas watched them. He’d never in his life seen Pell’s hands shake.</w:t>
+      </w:r>
+    </w:p>
+    <w:p>
+      <w:pPr>
+        <w:spacing w:before="0" w:after="0" w:lineRule="auto" w:line="276"/>
+        <w:ind w:left="0" w:right="0" w:firstLine="720"/>
+        <w:jc w:val="left"/>
+      </w:pPr>
+      <w:r>
+        <w:rPr>
+          <w:rFonts w:ascii="Times New Roman" w:hAnsi="Times New Roman" w:cs="Times New Roman" w:eastAsia="Times New Roman"/>
+          <w:color w:val="000000"/>
+          <w:sz w:val="24"/>
+        </w:rPr>
+        <w:t>“They come Tuesdays and Fridays,” Pell said finally, low. “I give them an envelope. They don’t say nothing, I don’t say nothing. Been six months.”</w:t>
+      </w:r>
+    </w:p>
+    <w:p>
+      <w:pPr>
+        <w:spacing w:before="0" w:after="0" w:lineRule="auto" w:line="276"/>
+        <w:ind w:left="0" w:right="0" w:firstLine="720"/>
+        <w:jc w:val="left"/>
+      </w:pPr>
+      <w:r>
+        <w:rPr>
+          <w:rFonts w:ascii="Times New Roman" w:hAnsi="Times New Roman" w:cs="Times New Roman" w:eastAsia="Times New Roman"/>
+          <w:color w:val="000000"/>
+          <w:sz w:val="24"/>
+        </w:rPr>
+        <w:t>Silas watched the rings on the counter instead of Pell’s face. “Who’s the envelope for?”</w:t>
+      </w:r>
+    </w:p>
+    <w:p>
+      <w:pPr>
+        <w:spacing w:before="0" w:after="0" w:lineRule="auto" w:line="276"/>
+        <w:ind w:left="0" w:right="0" w:firstLine="720"/>
+        <w:jc w:val="left"/>
+      </w:pPr>
+      <w:r>
+        <w:rPr>
+          <w:rFonts w:ascii="Times New Roman" w:hAnsi="Times New Roman" w:cs="Times New Roman" w:eastAsia="Times New Roman"/>
+          <w:color w:val="000000"/>
+          <w:sz w:val="24"/>
+        </w:rPr>
+        <w:t>“If I knew that, I’d be charging them for it.” Pell rubbed his knuckles harder. “They don’t come for salt. They come for the envelope, and they look at who’s buying while they here. Yesterday they looked at two people.”</w:t>
+      </w:r>
+    </w:p>
+    <w:p>
+      <w:pPr>
+        <w:spacing w:before="0" w:after="0" w:lineRule="auto" w:line="276"/>
+        <w:ind w:left="0" w:right="0" w:firstLine="720"/>
+        <w:jc w:val="left"/>
+      </w:pPr>
+      <w:r>
+        <w:rPr>
+          <w:rFonts w:ascii="Times New Roman" w:hAnsi="Times New Roman" w:cs="Times New Roman" w:eastAsia="Times New Roman"/>
+          <w:color w:val="000000"/>
+          <w:sz w:val="24"/>
+        </w:rPr>
+        <w:t>Silas waited.</w:t>
+      </w:r>
+    </w:p>
+    <w:p>
+      <w:pPr>
+        <w:spacing w:before="0" w:after="0" w:lineRule="auto" w:line="276"/>
+        <w:ind w:left="0" w:right="0" w:firstLine="720"/>
+        <w:jc w:val="left"/>
+      </w:pPr>
+      <w:r>
+        <w:rPr>
+          <w:rFonts w:ascii="Times New Roman" w:hAnsi="Times New Roman" w:cs="Times New Roman" w:eastAsia="Times New Roman"/>
+          <w:color w:val="000000"/>
+          <w:sz w:val="24"/>
+        </w:rPr>
+        <w:t>“The hood.” Pell lowered his voice even further. “And Rae’s girl.”</w:t>
+      </w:r>
+    </w:p>
+    <w:p>
+      <w:pPr>
+        <w:spacing w:before="0" w:after="0" w:lineRule="auto" w:line="276"/>
+        <w:ind w:left="0" w:right="0" w:firstLine="720"/>
+        <w:jc w:val="left"/>
+      </w:pPr>
+      <w:r>
+        <w:rPr>
+          <w:rFonts w:ascii="Times New Roman" w:hAnsi="Times New Roman" w:cs="Times New Roman" w:eastAsia="Times New Roman"/>
+          <w:color w:val="000000"/>
+          <w:sz w:val="24"/>
+        </w:rPr>
+        <w:t>Silas went still.</w:t>
+      </w:r>
+    </w:p>
+    <w:p>
+      <w:pPr>
+        <w:spacing w:before="0" w:after="0" w:lineRule="auto" w:line="276"/>
+        <w:ind w:left="0" w:right="0" w:firstLine="720"/>
+        <w:jc w:val="left"/>
+      </w:pPr>
+      <w:r>
+        <w:rPr>
+          <w:rFonts w:ascii="Times New Roman" w:hAnsi="Times New Roman" w:cs="Times New Roman" w:eastAsia="Times New Roman"/>
+          <w:color w:val="000000"/>
+          <w:sz w:val="24"/>
+        </w:rPr>
+        <w:t>“The salt girl,” Pell said. “The one you knocked. She came for Rae’s order. Had Rae’s token out on a cord, holding it up in my face ’cause I gave her the quarry cut first.” He shook his head. “I was trying to get her gone before they walked up, and she wouldn’t go. Stubborn like her godmama. And the one at the end of the counter looked at that token in her hand like he was writing it down.”</w:t>
+      </w:r>
+    </w:p>
+    <w:p>
+      <w:pPr>
+        <w:spacing w:before="0" w:after="0" w:lineRule="auto" w:line="276"/>
+        <w:ind w:left="0" w:right="0" w:firstLine="720"/>
+        <w:jc w:val="left"/>
+      </w:pPr>
+      <w:r>
+        <w:rPr>
+          <w:rFonts w:ascii="Times New Roman" w:hAnsi="Times New Roman" w:cs="Times New Roman" w:eastAsia="Times New Roman"/>
+          <w:color w:val="000000"/>
+          <w:sz w:val="24"/>
+        </w:rPr>
+        <w:t>Rae’s goddaughter.</w:t>
+      </w:r>
+    </w:p>
+    <w:p>
+      <w:pPr>
+        <w:spacing w:before="0" w:after="0" w:lineRule="auto" w:line="276"/>
+        <w:ind w:left="0" w:right="0" w:firstLine="720"/>
+        <w:jc w:val="left"/>
+      </w:pPr>
+      <w:r>
+        <w:rPr>
+          <w:rFonts w:ascii="Times New Roman" w:hAnsi="Times New Roman" w:cs="Times New Roman" w:eastAsia="Times New Roman"/>
+          <w:color w:val="000000"/>
+          <w:sz w:val="24"/>
+        </w:rPr>
+        <w:t>The Ashvein girl with the silver locs and the Ironcross rings and the hand jammed in her skirt was Rae’s. And the same two men who’d looked at the hood behind him had looked at Rae’s token around her neck, on the same afternoon, from the same end of the same counter.</w:t>
+      </w:r>
+    </w:p>
+    <w:p>
+      <w:pPr>
+        <w:spacing w:before="0" w:after="0" w:lineRule="auto" w:line="276"/>
+        <w:ind w:left="0" w:right="0" w:firstLine="720"/>
+        <w:jc w:val="left"/>
+      </w:pPr>
+      <w:r>
+        <w:rPr>
+          <w:rFonts w:ascii="Times New Roman" w:hAnsi="Times New Roman" w:cs="Times New Roman" w:eastAsia="Times New Roman"/>
+          <w:color w:val="000000"/>
+          <w:sz w:val="24"/>
+        </w:rPr>
+        <w:t>Melena had come down Rae’s routes. Rae’s routes had Quietcasters walking their edges. And now somebody had eyes on the people who carried Rae’s brass.</w:t>
+      </w:r>
+    </w:p>
+    <w:p>
+      <w:pPr>
+        <w:spacing w:before="0" w:after="0" w:lineRule="auto" w:line="276"/>
+        <w:ind w:left="0" w:right="0" w:firstLine="720"/>
+        <w:jc w:val="left"/>
+      </w:pPr>
+      <w:r>
+        <w:rPr>
+          <w:rFonts w:ascii="Times New Roman" w:hAnsi="Times New Roman" w:cs="Times New Roman" w:eastAsia="Times New Roman"/>
+          <w:color w:val="000000"/>
+          <w:sz w:val="24"/>
+        </w:rPr>
+        <w:t>“Her name,” Silas said.</w:t>
+      </w:r>
+    </w:p>
+    <w:p>
+      <w:pPr>
+        <w:spacing w:before="0" w:after="0" w:lineRule="auto" w:line="276"/>
+        <w:ind w:left="0" w:right="0" w:firstLine="720"/>
+        <w:jc w:val="left"/>
+      </w:pPr>
+      <w:r>
+        <w:rPr>
+          <w:rFonts w:ascii="Times New Roman" w:hAnsi="Times New Roman" w:cs="Times New Roman" w:eastAsia="Times New Roman"/>
+          <w:color w:val="000000"/>
+          <w:sz w:val="24"/>
+        </w:rPr>
+        <w:t>Pell gave him a long look. “You want her name, ask Rae. I got enough problems.”</w:t>
+      </w:r>
+    </w:p>
+    <w:p>
+      <w:pPr>
+        <w:spacing w:before="0" w:after="0" w:lineRule="auto" w:line="276"/>
+        <w:ind w:left="0" w:right="0" w:firstLine="720"/>
+        <w:jc w:val="left"/>
+      </w:pPr>
+      <w:r>
+        <w:rPr>
+          <w:rFonts w:ascii="Times New Roman" w:hAnsi="Times New Roman" w:cs="Times New Roman" w:eastAsia="Times New Roman"/>
+          <w:color w:val="000000"/>
+          <w:sz w:val="24"/>
+        </w:rPr>
+        <w:t>Silas didn’t argue.</w:t>
+      </w:r>
+    </w:p>
+    <w:p>
+      <w:pPr>
+        <w:spacing w:before="0" w:after="0" w:lineRule="auto" w:line="276"/>
+        <w:ind w:left="0" w:right="0" w:firstLine="720"/>
+        <w:jc w:val="left"/>
+      </w:pPr>
+      <w:r>
+        <w:rPr>
+          <w:rFonts w:ascii="Times New Roman" w:hAnsi="Times New Roman" w:cs="Times New Roman" w:eastAsia="Times New Roman"/>
+          <w:color w:val="000000"/>
+          <w:sz w:val="24"/>
+        </w:rPr>
+        <w:t>Silas straightened up off the counter. “She pays what I pay from now on.”</w:t>
+      </w:r>
+    </w:p>
+    <w:p>
+      <w:pPr>
+        <w:spacing w:before="0" w:after="0" w:lineRule="auto" w:line="276"/>
+        <w:ind w:left="0" w:right="0" w:firstLine="720"/>
+        <w:jc w:val="left"/>
+      </w:pPr>
+      <w:r>
+        <w:rPr>
+          <w:rFonts w:ascii="Times New Roman" w:hAnsi="Times New Roman" w:cs="Times New Roman" w:eastAsia="Times New Roman"/>
+          <w:color w:val="000000"/>
+          <w:sz w:val="24"/>
+        </w:rPr>
+        <w:t>Pell’s eyebrows climbed. “Rae’s order? That’s eighteen Veils of funeral grade, I got a cost—“</w:t>
+      </w:r>
+    </w:p>
+    <w:p>
+      <w:pPr>
+        <w:spacing w:before="0" w:after="0" w:lineRule="auto" w:line="276"/>
+        <w:ind w:left="0" w:right="0" w:firstLine="720"/>
+        <w:jc w:val="left"/>
+      </w:pPr>
+      <w:r>
+        <w:rPr>
+          <w:rFonts w:ascii="Times New Roman" w:hAnsi="Times New Roman" w:cs="Times New Roman" w:eastAsia="Times New Roman"/>
+          <w:color w:val="000000"/>
+          <w:sz w:val="24"/>
+        </w:rPr>
+        <w:t>“She pays what I pay.” Silas laid two Veils down next to Pell’s rings. “You got a problem with the difference, put it on Camille.”</w:t>
+      </w:r>
+    </w:p>
+    <w:p>
+      <w:pPr>
+        <w:spacing w:before="0" w:after="0" w:lineRule="auto" w:line="276"/>
+        <w:ind w:left="0" w:right="0" w:firstLine="720"/>
+        <w:jc w:val="left"/>
+      </w:pPr>
+      <w:r>
+        <w:rPr>
+          <w:rFonts w:ascii="Times New Roman" w:hAnsi="Times New Roman" w:cs="Times New Roman" w:eastAsia="Times New Roman"/>
+          <w:color w:val="000000"/>
+          <w:sz w:val="24"/>
+        </w:rPr>
+        <w:t>Pell looked at the coins and didn’t touch them. “Camille know she paying for all this?”</w:t>
+      </w:r>
+    </w:p>
+    <w:p>
+      <w:pPr>
+        <w:spacing w:before="0" w:after="0" w:lineRule="auto" w:line="276"/>
+        <w:ind w:left="0" w:right="0" w:firstLine="720"/>
+        <w:jc w:val="left"/>
+      </w:pPr>
+      <w:r>
+        <w:rPr>
+          <w:rFonts w:ascii="Times New Roman" w:hAnsi="Times New Roman" w:cs="Times New Roman" w:eastAsia="Times New Roman"/>
+          <w:color w:val="000000"/>
+          <w:sz w:val="24"/>
+        </w:rPr>
+        <w:t>“She will,” Silas said, and walked back up the lane.</w:t>
+      </w:r>
+    </w:p>
+    <w:p>
+      <w:pPr>
+        <w:spacing w:before="0" w:after="0" w:lineRule="auto" w:line="276"/>
+        <w:ind w:left="0" w:right="0" w:firstLine="0"/>
+        <w:jc w:val="left"/>
+      </w:pPr>
+      <w:r>
+        <w:rPr>
+          <w:rFonts w:ascii="Times New Roman" w:hAnsi="Times New Roman" w:cs="Times New Roman" w:eastAsia="Times New Roman"/>
+          <w:color w:val="000000"/>
+          <w:sz w:val="24"/>
+        </w:rPr>
+        <w:t>#</w:t>
+      </w:r>
+    </w:p>
+    <w:p>
+      <w:pPr>
+        <w:spacing w:before="0" w:after="0" w:lineRule="auto" w:line="276"/>
+        <w:ind w:left="0" w:right="0" w:firstLine="720"/>
+        <w:jc w:val="left"/>
+      </w:pPr>
+      <w:r>
+        <w:rPr>
+          <w:rFonts w:ascii="Times New Roman" w:hAnsi="Times New Roman" w:cs="Times New Roman" w:eastAsia="Times New Roman"/>
+          <w:color w:val="000000"/>
+          <w:sz w:val="24"/>
+        </w:rPr>
+        <w:t>The cavern lights were coming up grey for first bell when he got back to the dark house. Teo was already gone from the pawn-counter doorway. The coffee cup was gone too.</w:t>
+      </w:r>
+    </w:p>
+    <w:p>
+      <w:pPr>
+        <w:spacing w:before="0" w:after="0" w:lineRule="auto" w:line="276"/>
+        <w:ind w:left="0" w:right="0" w:firstLine="720"/>
+        <w:jc w:val="left"/>
+      </w:pPr>
+      <w:r>
+        <w:rPr>
+          <w:rFonts w:ascii="Times New Roman" w:hAnsi="Times New Roman" w:cs="Times New Roman" w:eastAsia="Times New Roman"/>
+          <w:color w:val="000000"/>
+          <w:sz w:val="24"/>
+        </w:rPr>
+        <w:t>Silas sat down on the step and took out his phone.</w:t>
+      </w:r>
+    </w:p>
+    <w:p>
+      <w:pPr>
+        <w:spacing w:before="0" w:after="0" w:lineRule="auto" w:line="276"/>
+        <w:ind w:left="0" w:right="0" w:firstLine="720"/>
+        <w:jc w:val="left"/>
+      </w:pPr>
+      <w:r>
+        <w:rPr>
+          <w:rFonts w:ascii="Times New Roman" w:hAnsi="Times New Roman" w:cs="Times New Roman" w:eastAsia="Times New Roman"/>
+          <w:i/>
+          <w:color w:val="000000"/>
+          <w:sz w:val="24"/>
+        </w:rPr>
+        <w:t>Silas: Where’s breakfast?</w:t>
+      </w:r>
+    </w:p>
+    <w:p>
+      <w:pPr>
+        <w:spacing w:before="0" w:after="0" w:lineRule="auto" w:line="276"/>
+        <w:ind w:left="0" w:right="0" w:firstLine="720"/>
+        <w:jc w:val="left"/>
+      </w:pPr>
+      <w:r>
+        <w:rPr>
+          <w:rFonts w:ascii="Times New Roman" w:hAnsi="Times New Roman" w:cs="Times New Roman" w:eastAsia="Times New Roman"/>
+          <w:color w:val="000000"/>
+          <w:sz w:val="24"/>
+        </w:rPr>
+        <w:t>Through the door behind him, he could hear Camille on her own phone. She wasn’t raising her voice. She never did. She said four sentences to his father in a tone that could’ve frosted a window, and then she was quiet for a long time, listening, and then she said, “You can come or you can not come, Dante. But if you don’t come, I’m not coming home.”</w:t>
+      </w:r>
+    </w:p>
+    <w:p>
+      <w:pPr>
+        <w:spacing w:before="0" w:after="0" w:lineRule="auto" w:line="276"/>
+        <w:ind w:left="0" w:right="0" w:firstLine="720"/>
+        <w:jc w:val="left"/>
+      </w:pPr>
+      <w:r>
+        <w:rPr>
+          <w:rFonts w:ascii="Times New Roman" w:hAnsi="Times New Roman" w:cs="Times New Roman" w:eastAsia="Times New Roman"/>
+          <w:color w:val="000000"/>
+          <w:sz w:val="24"/>
+        </w:rPr>
+        <w:t>The call ended. The house went quiet. Silas didn’t go in.</w:t>
+      </w:r>
+    </w:p>
+    <w:p>
+      <w:pPr>
+        <w:spacing w:before="0" w:after="0" w:lineRule="auto" w:line="276"/>
+        <w:ind w:left="0" w:right="0" w:firstLine="720"/>
+        <w:jc w:val="left"/>
+      </w:pPr>
+      <w:r>
+        <w:rPr>
+          <w:rFonts w:ascii="Times New Roman" w:hAnsi="Times New Roman" w:cs="Times New Roman" w:eastAsia="Times New Roman"/>
+          <w:color w:val="000000"/>
+          <w:sz w:val="24"/>
+        </w:rPr>
+        <w:t>Remy came around the corner from the tram stop twenty-five minutes later with three paper sacks stacked against his chest and his messenger bag banging against his hip. He looked like he hadn’t slept either. He also looked like he was about to enjoy himself, which on no sleep was a dangerous combination.</w:t>
+      </w:r>
+    </w:p>
+    <w:p>
+      <w:pPr>
+        <w:spacing w:before="0" w:after="0" w:lineRule="auto" w:line="276"/>
+        <w:ind w:left="0" w:right="0" w:firstLine="720"/>
+        <w:jc w:val="left"/>
+      </w:pPr>
+      <w:r>
+        <w:rPr>
+          <w:rFonts w:ascii="Times New Roman" w:hAnsi="Times New Roman" w:cs="Times New Roman" w:eastAsia="Times New Roman"/>
+          <w:color w:val="000000"/>
+          <w:sz w:val="24"/>
+        </w:rPr>
+        <w:t>“Morning,” Remy said, and set the sacks on the step. “So. Funny story.”</w:t>
+      </w:r>
+    </w:p>
+    <w:p>
+      <w:pPr>
+        <w:spacing w:before="0" w:after="0" w:lineRule="auto" w:line="276"/>
+        <w:ind w:left="0" w:right="0" w:firstLine="720"/>
+        <w:jc w:val="left"/>
+      </w:pPr>
+      <w:r>
+        <w:rPr>
+          <w:rFonts w:ascii="Times New Roman" w:hAnsi="Times New Roman" w:cs="Times New Roman" w:eastAsia="Times New Roman"/>
+          <w:color w:val="000000"/>
+          <w:sz w:val="24"/>
+        </w:rPr>
+        <w:t>“Rae’s goddaughter,” Silas said. “Sixth Ward. Salt for your mama’s order.”</w:t>
+      </w:r>
+    </w:p>
+    <w:p>
+      <w:pPr>
+        <w:spacing w:before="0" w:after="0" w:lineRule="auto" w:line="276"/>
+        <w:ind w:left="0" w:right="0" w:firstLine="720"/>
+        <w:jc w:val="left"/>
+      </w:pPr>
+      <w:r>
+        <w:rPr>
+          <w:rFonts w:ascii="Times New Roman" w:hAnsi="Times New Roman" w:cs="Times New Roman" w:eastAsia="Times New Roman"/>
+          <w:color w:val="000000"/>
+          <w:sz w:val="24"/>
+        </w:rPr>
+        <w:t>Remy stopped with his hand still on the top sack. The grin went out of his face like somebody had pulled a plug. “Who told you?”</w:t>
+      </w:r>
+    </w:p>
+    <w:p>
+      <w:pPr>
+        <w:spacing w:before="0" w:after="0" w:lineRule="auto" w:line="276"/>
+        <w:ind w:left="0" w:right="0" w:firstLine="720"/>
+        <w:jc w:val="left"/>
+      </w:pPr>
+      <w:r>
+        <w:rPr>
+          <w:rFonts w:ascii="Times New Roman" w:hAnsi="Times New Roman" w:cs="Times New Roman" w:eastAsia="Times New Roman"/>
+          <w:color w:val="000000"/>
+          <w:sz w:val="24"/>
+        </w:rPr>
+        <w:t>Silas reached past him for the top sack. “Pell.”</w:t>
+      </w:r>
+    </w:p>
+    <w:p>
+      <w:pPr>
+        <w:spacing w:before="0" w:after="0" w:lineRule="auto" w:line="276"/>
+        <w:ind w:left="0" w:right="0" w:firstLine="720"/>
+        <w:jc w:val="left"/>
+      </w:pPr>
+      <w:r>
+        <w:rPr>
+          <w:rFonts w:ascii="Times New Roman" w:hAnsi="Times New Roman" w:cs="Times New Roman" w:eastAsia="Times New Roman"/>
+          <w:color w:val="000000"/>
+          <w:sz w:val="24"/>
+        </w:rPr>
+        <w:t>“</w:t>
+      </w:r>
+      <w:r>
+        <w:rPr>
+          <w:rFonts w:ascii="Times New Roman" w:hAnsi="Times New Roman" w:cs="Times New Roman" w:eastAsia="Times New Roman"/>
+          <w:i/>
+          <w:color w:val="000000"/>
+          <w:sz w:val="24"/>
+        </w:rPr>
+        <w:t>Pell</w:t>
+      </w:r>
+      <w:r>
+        <w:rPr>
+          <w:rFonts w:ascii="Times New Roman" w:hAnsi="Times New Roman" w:cs="Times New Roman" w:eastAsia="Times New Roman"/>
+          <w:color w:val="000000"/>
+          <w:sz w:val="24"/>
+        </w:rPr>
+        <w:t>?” Remy straightened up. “I been holding that since four this morning. I had a whole thing.”</w:t>
+      </w:r>
+    </w:p>
+    <w:p>
+      <w:pPr>
+        <w:spacing w:before="0" w:after="0" w:lineRule="auto" w:line="276"/>
+        <w:ind w:left="0" w:right="0" w:firstLine="720"/>
+        <w:jc w:val="left"/>
+      </w:pPr>
+      <w:r>
+        <w:rPr>
+          <w:rFonts w:ascii="Times New Roman" w:hAnsi="Times New Roman" w:cs="Times New Roman" w:eastAsia="Times New Roman"/>
+          <w:color w:val="000000"/>
+          <w:sz w:val="24"/>
+        </w:rPr>
+        <w:t>“I know you did.” Silas took the top sack and looked inside. Fried dough, still hot. “She came to your mama’s.”</w:t>
+      </w:r>
+    </w:p>
+    <w:p>
+      <w:pPr>
+        <w:spacing w:before="0" w:after="0" w:lineRule="auto" w:line="276"/>
+        <w:ind w:left="0" w:right="0" w:firstLine="720"/>
+        <w:jc w:val="left"/>
+      </w:pPr>
+      <w:r>
+        <w:rPr>
+          <w:rFonts w:ascii="Times New Roman" w:hAnsi="Times New Roman" w:cs="Times New Roman" w:eastAsia="Times New Roman"/>
+          <w:color w:val="000000"/>
+          <w:sz w:val="24"/>
+        </w:rPr>
+        <w:t xml:space="preserve">“She came to see </w:t>
+      </w:r>
+      <w:r>
+        <w:rPr>
+          <w:rFonts w:ascii="Times New Roman" w:hAnsi="Times New Roman" w:cs="Times New Roman" w:eastAsia="Times New Roman"/>
+          <w:i/>
+          <w:color w:val="000000"/>
+          <w:sz w:val="24"/>
+        </w:rPr>
+        <w:t>me</w:t>
+      </w:r>
+      <w:r>
+        <w:rPr>
+          <w:rFonts w:ascii="Times New Roman" w:hAnsi="Times New Roman" w:cs="Times New Roman" w:eastAsia="Times New Roman"/>
+          <w:color w:val="000000"/>
+          <w:sz w:val="24"/>
+        </w:rPr>
+        <w:t>.” Remy said it a little sharper than he meant to, and he heard it, and he sat down on the step next to Silas with his elbows on his knees. “Ma wasn’t there.”</w:t>
+      </w:r>
+    </w:p>
+    <w:p>
+      <w:pPr>
+        <w:spacing w:before="0" w:after="0" w:lineRule="auto" w:line="276"/>
+        <w:ind w:left="0" w:right="0" w:firstLine="720"/>
+        <w:jc w:val="left"/>
+      </w:pPr>
+      <w:r>
+        <w:rPr>
+          <w:rFonts w:ascii="Times New Roman" w:hAnsi="Times New Roman" w:cs="Times New Roman" w:eastAsia="Times New Roman"/>
+          <w:color w:val="000000"/>
+          <w:sz w:val="24"/>
+        </w:rPr>
+        <w:t>Silas tore a piece of dough in half and didn’t eat it. “She all right?”</w:t>
+      </w:r>
+    </w:p>
+    <w:p>
+      <w:pPr>
+        <w:spacing w:before="0" w:after="0" w:lineRule="auto" w:line="276"/>
+        <w:ind w:left="0" w:right="0" w:firstLine="720"/>
+        <w:jc w:val="left"/>
+      </w:pPr>
+      <w:r>
+        <w:rPr>
+          <w:rFonts w:ascii="Times New Roman" w:hAnsi="Times New Roman" w:cs="Times New Roman" w:eastAsia="Times New Roman"/>
+          <w:color w:val="000000"/>
+          <w:sz w:val="24"/>
+        </w:rPr>
+        <w:t>Remy turned his head and looked at him.</w:t>
+      </w:r>
+    </w:p>
+    <w:p>
+      <w:pPr>
+        <w:spacing w:before="0" w:after="0" w:lineRule="auto" w:line="276"/>
+        <w:ind w:left="0" w:right="0" w:firstLine="720"/>
+        <w:jc w:val="left"/>
+      </w:pPr>
+      <w:r>
+        <w:rPr>
+          <w:rFonts w:ascii="Times New Roman" w:hAnsi="Times New Roman" w:cs="Times New Roman" w:eastAsia="Times New Roman"/>
+          <w:color w:val="000000"/>
+          <w:sz w:val="24"/>
+        </w:rPr>
+        <w:t>It took Remy a second. Silas watched him run the question back, watched him notice it wasn’t the question he’d been ready for, and watched him decide what to do about that.</w:t>
+      </w:r>
+    </w:p>
+    <w:p>
+      <w:pPr>
+        <w:spacing w:before="0" w:after="0" w:lineRule="auto" w:line="276"/>
+        <w:ind w:left="0" w:right="0" w:firstLine="720"/>
+        <w:jc w:val="left"/>
+      </w:pPr>
+      <w:r>
+        <w:rPr>
+          <w:rFonts w:ascii="Times New Roman" w:hAnsi="Times New Roman" w:cs="Times New Roman" w:eastAsia="Times New Roman"/>
+          <w:color w:val="000000"/>
+          <w:sz w:val="24"/>
+        </w:rPr>
+        <w:t>“She’s handling something,” Remy said finally. “Family business. She asked me to help her with it, and I said I would.”</w:t>
+      </w:r>
+    </w:p>
+    <w:p>
+      <w:pPr>
+        <w:spacing w:before="0" w:after="0" w:lineRule="auto" w:line="276"/>
+        <w:ind w:left="0" w:right="0" w:firstLine="720"/>
+        <w:jc w:val="left"/>
+      </w:pPr>
+      <w:r>
+        <w:rPr>
+          <w:rFonts w:ascii="Times New Roman" w:hAnsi="Times New Roman" w:cs="Times New Roman" w:eastAsia="Times New Roman"/>
+          <w:color w:val="000000"/>
+          <w:sz w:val="24"/>
+        </w:rPr>
+        <w:t>Silas waited for more. When it didn’t come, he asked for it. “What business?”</w:t>
+      </w:r>
+    </w:p>
+    <w:p>
+      <w:pPr>
+        <w:spacing w:before="0" w:after="0" w:lineRule="auto" w:line="276"/>
+        <w:ind w:left="0" w:right="0" w:firstLine="720"/>
+        <w:jc w:val="left"/>
+      </w:pPr>
+      <w:r>
+        <w:rPr>
+          <w:rFonts w:ascii="Times New Roman" w:hAnsi="Times New Roman" w:cs="Times New Roman" w:eastAsia="Times New Roman"/>
+          <w:color w:val="000000"/>
+          <w:sz w:val="24"/>
+        </w:rPr>
+        <w:t>Remy looked out at the street. “Family business, Si.”</w:t>
+      </w:r>
+    </w:p>
+    <w:p>
+      <w:pPr>
+        <w:spacing w:before="0" w:after="0" w:lineRule="auto" w:line="276"/>
+        <w:ind w:left="0" w:right="0" w:firstLine="720"/>
+        <w:jc w:val="left"/>
+      </w:pPr>
+      <w:r>
+        <w:rPr>
+          <w:rFonts w:ascii="Times New Roman" w:hAnsi="Times New Roman" w:cs="Times New Roman" w:eastAsia="Times New Roman"/>
+          <w:color w:val="000000"/>
+          <w:sz w:val="24"/>
+        </w:rPr>
+        <w:t>Remy had told Silas everything since they were six, including a whole lot Silas would’ve paid good money not to know. He’d never once in his life needed to be asked twice.</w:t>
+      </w:r>
+    </w:p>
+    <w:p>
+      <w:pPr>
+        <w:spacing w:before="0" w:after="0" w:lineRule="auto" w:line="276"/>
+        <w:ind w:left="0" w:right="0" w:firstLine="720"/>
+        <w:jc w:val="left"/>
+      </w:pPr>
+      <w:r>
+        <w:rPr>
+          <w:rFonts w:ascii="Times New Roman" w:hAnsi="Times New Roman" w:cs="Times New Roman" w:eastAsia="Times New Roman"/>
+          <w:color w:val="000000"/>
+          <w:sz w:val="24"/>
+        </w:rPr>
+        <w:t xml:space="preserve">And he’d just looked Silas in the face and said </w:t>
+      </w:r>
+      <w:r>
+        <w:rPr>
+          <w:rFonts w:ascii="Times New Roman" w:hAnsi="Times New Roman" w:cs="Times New Roman" w:eastAsia="Times New Roman"/>
+          <w:i/>
+          <w:color w:val="000000"/>
+          <w:sz w:val="24"/>
+        </w:rPr>
+        <w:t>family business</w:t>
+      </w:r>
+      <w:r>
+        <w:rPr>
+          <w:rFonts w:ascii="Times New Roman" w:hAnsi="Times New Roman" w:cs="Times New Roman" w:eastAsia="Times New Roman"/>
+          <w:color w:val="000000"/>
+          <w:sz w:val="24"/>
+        </w:rPr>
+        <w:t xml:space="preserve"> twice.</w:t>
+      </w:r>
+    </w:p>
+    <w:p>
+      <w:pPr>
+        <w:spacing w:before="0" w:after="0" w:lineRule="auto" w:line="276"/>
+        <w:ind w:left="0" w:right="0" w:firstLine="720"/>
+        <w:jc w:val="left"/>
+      </w:pPr>
+      <w:r>
+        <w:rPr>
+          <w:rFonts w:ascii="Times New Roman" w:hAnsi="Times New Roman" w:cs="Times New Roman" w:eastAsia="Times New Roman"/>
+          <w:color w:val="000000"/>
+          <w:sz w:val="24"/>
+        </w:rPr>
+        <w:t>Silas didn’t push it. He put the dough down on the paper.</w:t>
+      </w:r>
+    </w:p>
+    <w:p>
+      <w:pPr>
+        <w:spacing w:before="0" w:after="0" w:lineRule="auto" w:line="276"/>
+        <w:ind w:left="0" w:right="0" w:firstLine="720"/>
+        <w:jc w:val="left"/>
+      </w:pPr>
+      <w:r>
+        <w:rPr>
+          <w:rFonts w:ascii="Times New Roman" w:hAnsi="Times New Roman" w:cs="Times New Roman" w:eastAsia="Times New Roman"/>
+          <w:color w:val="000000"/>
+          <w:sz w:val="24"/>
+        </w:rPr>
+        <w:t>“The two men who come for Pell’s envelope,” he said. “Tuesdays and Fridays. Yesterday they looked at the hood behind me, and they looked at Rae’s token in her hand. Same men. Same counter. Same afternoon.”</w:t>
+      </w:r>
+    </w:p>
+    <w:p>
+      <w:pPr>
+        <w:spacing w:before="0" w:after="0" w:lineRule="auto" w:line="276"/>
+        <w:ind w:left="0" w:right="0" w:firstLine="720"/>
+        <w:jc w:val="left"/>
+      </w:pPr>
+      <w:r>
+        <w:rPr>
+          <w:rFonts w:ascii="Times New Roman" w:hAnsi="Times New Roman" w:cs="Times New Roman" w:eastAsia="Times New Roman"/>
+          <w:color w:val="000000"/>
+          <w:sz w:val="24"/>
+        </w:rPr>
+        <w:t>Remy went still.</w:t>
+      </w:r>
+    </w:p>
+    <w:p>
+      <w:pPr>
+        <w:spacing w:before="0" w:after="0" w:lineRule="auto" w:line="276"/>
+        <w:ind w:left="0" w:right="0" w:firstLine="720"/>
+        <w:jc w:val="left"/>
+      </w:pPr>
+      <w:r>
+        <w:rPr>
+          <w:rFonts w:ascii="Times New Roman" w:hAnsi="Times New Roman" w:cs="Times New Roman" w:eastAsia="Times New Roman"/>
+          <w:color w:val="000000"/>
+          <w:sz w:val="24"/>
+        </w:rPr>
+        <w:t>“She told me about them,” he said quietly. “This morning. Two of ’em. One stood right next to her and took an envelope from Pell. The other one stared at her hand.”</w:t>
+      </w:r>
+    </w:p>
+    <w:p>
+      <w:pPr>
+        <w:spacing w:before="0" w:after="0" w:lineRule="auto" w:line="276"/>
+        <w:ind w:left="0" w:right="0" w:firstLine="720"/>
+        <w:jc w:val="left"/>
+      </w:pPr>
+      <w:r>
+        <w:rPr>
+          <w:rFonts w:ascii="Times New Roman" w:hAnsi="Times New Roman" w:cs="Times New Roman" w:eastAsia="Times New Roman"/>
+          <w:color w:val="000000"/>
+          <w:sz w:val="24"/>
+        </w:rPr>
+        <w:t>Silas picked the dough back up and looked at it. “So they’ve seen both of them.”</w:t>
+      </w:r>
+    </w:p>
+    <w:p>
+      <w:pPr>
+        <w:spacing w:before="0" w:after="0" w:lineRule="auto" w:line="276"/>
+        <w:ind w:left="0" w:right="0" w:firstLine="720"/>
+        <w:jc w:val="left"/>
+      </w:pPr>
+      <w:r>
+        <w:rPr>
+          <w:rFonts w:ascii="Times New Roman" w:hAnsi="Times New Roman" w:cs="Times New Roman" w:eastAsia="Times New Roman"/>
+          <w:color w:val="000000"/>
+          <w:sz w:val="24"/>
+        </w:rPr>
+        <w:t>Remy dug a mint out of his pocket and turned it over in his fingers. “You think it’s the same people.”</w:t>
+      </w:r>
+    </w:p>
+    <w:p>
+      <w:pPr>
+        <w:spacing w:before="0" w:after="0" w:lineRule="auto" w:line="276"/>
+        <w:ind w:left="0" w:right="0" w:firstLine="720"/>
+        <w:jc w:val="left"/>
+      </w:pPr>
+      <w:r>
+        <w:rPr>
+          <w:rFonts w:ascii="Times New Roman" w:hAnsi="Times New Roman" w:cs="Times New Roman" w:eastAsia="Times New Roman"/>
+          <w:color w:val="000000"/>
+          <w:sz w:val="24"/>
+        </w:rPr>
+        <w:t>“I think Melena came down your mama’s routes, and Quietcasters are walking your mama’s routes, and now somebody’s watching who carries your mama’s brass.” Silas looked down the street toward Lamp Street, where the skewer man was setting up his cart in the drizzle like nothing had ever happened there. “I don’t think it’s three different people having a busy week.”</w:t>
+      </w:r>
+    </w:p>
+    <w:p>
+      <w:pPr>
+        <w:spacing w:before="0" w:after="0" w:lineRule="auto" w:line="276"/>
+        <w:ind w:left="0" w:right="0" w:firstLine="720"/>
+        <w:jc w:val="left"/>
+      </w:pPr>
+      <w:r>
+        <w:rPr>
+          <w:rFonts w:ascii="Times New Roman" w:hAnsi="Times New Roman" w:cs="Times New Roman" w:eastAsia="Times New Roman"/>
+          <w:color w:val="000000"/>
+          <w:sz w:val="24"/>
+        </w:rPr>
+        <w:t>Remy didn’t say anything. He closed his fist around the mint without unwrapping it.</w:t>
+      </w:r>
+    </w:p>
+    <w:p>
+      <w:pPr>
+        <w:spacing w:before="0" w:after="0" w:lineRule="auto" w:line="276"/>
+        <w:ind w:left="0" w:right="0" w:firstLine="720"/>
+        <w:jc w:val="left"/>
+      </w:pPr>
+      <w:r>
+        <w:rPr>
+          <w:rFonts w:ascii="Times New Roman" w:hAnsi="Times New Roman" w:cs="Times New Roman" w:eastAsia="Times New Roman"/>
+          <w:color w:val="000000"/>
+          <w:sz w:val="24"/>
+        </w:rPr>
+        <w:t>“Does Ma know?” he said finally.</w:t>
+      </w:r>
+    </w:p>
+    <w:p>
+      <w:pPr>
+        <w:spacing w:before="0" w:after="0" w:lineRule="auto" w:line="276"/>
+        <w:ind w:left="0" w:right="0" w:firstLine="720"/>
+        <w:jc w:val="left"/>
+      </w:pPr>
+      <w:r>
+        <w:rPr>
+          <w:rFonts w:ascii="Times New Roman" w:hAnsi="Times New Roman" w:cs="Times New Roman" w:eastAsia="Times New Roman"/>
+          <w:color w:val="000000"/>
+          <w:sz w:val="24"/>
+        </w:rPr>
+        <w:t>“Your mama knows everything.” Silas picked up his coffee cup, found it empty, and set it down again. “She just ain’t telling.”</w:t>
+      </w:r>
+    </w:p>
+    <w:p>
+      <w:pPr>
+        <w:spacing w:before="0" w:after="0" w:lineRule="auto" w:line="276"/>
+        <w:ind w:left="0" w:right="0" w:firstLine="720"/>
+        <w:jc w:val="left"/>
+      </w:pPr>
+      <w:r>
+        <w:rPr>
+          <w:rFonts w:ascii="Times New Roman" w:hAnsi="Times New Roman" w:cs="Times New Roman" w:eastAsia="Times New Roman"/>
+          <w:color w:val="000000"/>
+          <w:sz w:val="24"/>
+        </w:rPr>
+        <w:t>Behind them, the door opened. Camille stood in the doorway in her robe, with her glasses on top of her head and the crossword folded under her arm, and she looked at the two of them sitting on her step with the breakfast going cold.</w:t>
+      </w:r>
+    </w:p>
+    <w:p>
+      <w:pPr>
+        <w:spacing w:before="0" w:after="0" w:lineRule="auto" w:line="276"/>
+        <w:ind w:left="0" w:right="0" w:firstLine="720"/>
+        <w:jc w:val="left"/>
+      </w:pPr>
+      <w:r>
+        <w:rPr>
+          <w:rFonts w:ascii="Times New Roman" w:hAnsi="Times New Roman" w:cs="Times New Roman" w:eastAsia="Times New Roman"/>
+          <w:color w:val="000000"/>
+          <w:sz w:val="24"/>
+        </w:rPr>
+        <w:t>“Your daddy’s not coming,” she said to Silas. “So we’re going to Ora’s without him.”</w:t>
+      </w:r>
+    </w:p>
+    <w:p>
+      <w:pPr>
+        <w:spacing w:before="0" w:after="0" w:lineRule="auto" w:line="276"/>
+        <w:ind w:left="0" w:right="0" w:firstLine="720"/>
+        <w:jc w:val="left"/>
+      </w:pPr>
+      <w:r>
+        <w:rPr>
+          <w:rFonts w:ascii="Times New Roman" w:hAnsi="Times New Roman" w:cs="Times New Roman" w:eastAsia="Times New Roman"/>
+          <w:color w:val="000000"/>
+          <w:sz w:val="24"/>
+        </w:rPr>
+        <w:t>She looked at the sacks.</w:t>
+      </w:r>
+    </w:p>
+    <w:p>
+      <w:pPr>
+        <w:spacing w:before="0" w:after="0" w:lineRule="auto" w:line="276"/>
+        <w:ind w:left="0" w:right="0" w:firstLine="720"/>
+        <w:jc w:val="left"/>
+      </w:pPr>
+      <w:r>
+        <w:rPr>
+          <w:rFonts w:ascii="Times New Roman" w:hAnsi="Times New Roman" w:cs="Times New Roman" w:eastAsia="Times New Roman"/>
+          <w:color w:val="000000"/>
+          <w:sz w:val="24"/>
+        </w:rPr>
+        <w:t>“Remington. Bring the food in. That child’s gonna need to eat before somebody puts her in a Hush den.”</w:t>
       </w:r>
     </w:p>
     <w:sectPr>

</xml_diff>